<commit_message>
Add a minimal end-to-end usage example to the Word guide.
Co-authored-by: Cursor <cursoragent@cursor.com>
</commit_message>
<xml_diff>
--- a/绿电直连微电网容量规划-使用说明.docx
+++ b/绿电直连微电网容量规划-使用说明.docx
@@ -1165,7 +1165,1339 @@
           <w:color w:val="1F4E79"/>
           <w:sz w:val="28"/>
         </w:rPr>
-        <w:t>2.3 修改默认参数</w:t>
+        <w:t>2.3 最小使用案例</w:t>
+      </w:r>
+    </w:p>
+    <w:p>
+      <w:pPr>
+        <w:spacing w:after="120" w:before="0" w:line="360" w:lineRule="auto"/>
+        <w:ind w:firstLine="420"/>
+      </w:pPr>
+      <w:r>
+        <w:rPr>
+          <w:rFonts w:ascii="Times New Roman" w:hAnsi="Times New Roman" w:eastAsia="宋体" w:cs="Times New Roman"/>
+          <w:b w:val="0"/>
+          <w:sz w:val="24"/>
+        </w:rPr>
+        <w:t>不改 params.py、不指定 --out，只跑一条命令，即可完成一次容量优化。本案例固定并网变压器 60 MW，风光自发自用转移电价为 0（免费绿电口径），政策参数沿用默认：φ=0.6、θ=0.3、ψ=0.2，投资按 8%、15 年折算（CRF）。</w:t>
+      </w:r>
+    </w:p>
+    <w:p>
+      <w:pPr>
+        <w:pStyle w:val="Heading3"/>
+        <w:spacing w:before="160" w:after="120"/>
+        <w:ind w:firstLine="0"/>
+      </w:pPr>
+      <w:r>
+        <w:rPr>
+          <w:rFonts w:ascii="Arial" w:hAnsi="Arial" w:eastAsia="黑体" w:cs="Arial"/>
+          <w:b/>
+          <w:color w:val="1F4E79"/>
+          <w:sz w:val="24"/>
+        </w:rPr>
+        <w:t>步骤</w:t>
+      </w:r>
+    </w:p>
+    <w:tbl>
+      <w:tblPr>
+        <w:tblW w:type="auto" w:w="0"/>
+        <w:jc w:val="center"/>
+        <w:tblLook w:firstColumn="1" w:firstRow="1" w:lastColumn="0" w:lastRow="0" w:noHBand="0" w:noVBand="1" w:val="04A0"/>
+      </w:tblPr>
+      <w:tblGrid>
+        <w:gridCol w:w="3060"/>
+        <w:gridCol w:w="3060"/>
+        <w:gridCol w:w="3060"/>
+      </w:tblGrid>
+      <w:tr>
+        <w:tc>
+          <w:tcPr>
+            <w:tcW w:type="dxa" w:w="3060"/>
+            <w:shd w:fill="1F4E79" w:val="clear"/>
+            <w:tcBorders>
+              <w:top w:val="single" w:sz="4" w:space="0" w:color="8FAADC"/>
+              <w:left w:val="single" w:sz="4" w:space="0" w:color="8FAADC"/>
+              <w:bottom w:val="single" w:sz="4" w:space="0" w:color="8FAADC"/>
+              <w:right w:val="single" w:sz="4" w:space="0" w:color="8FAADC"/>
+            </w:tcBorders>
+          </w:tcPr>
+          <w:p>
+            <w:pPr>
+              <w:jc w:val="center"/>
+            </w:pPr>
+            <w:r/>
+            <w:r>
+              <w:rPr>
+                <w:rFonts w:ascii="Times New Roman" w:hAnsi="Times New Roman" w:eastAsia="黑体" w:cs="Times New Roman"/>
+                <w:b/>
+                <w:color w:val="FFFFFF"/>
+                <w:sz w:val="21"/>
+              </w:rPr>
+              <w:t>步骤</w:t>
+            </w:r>
+          </w:p>
+        </w:tc>
+        <w:tc>
+          <w:tcPr>
+            <w:tcW w:type="dxa" w:w="3060"/>
+            <w:shd w:fill="1F4E79" w:val="clear"/>
+            <w:tcBorders>
+              <w:top w:val="single" w:sz="4" w:space="0" w:color="8FAADC"/>
+              <w:left w:val="single" w:sz="4" w:space="0" w:color="8FAADC"/>
+              <w:bottom w:val="single" w:sz="4" w:space="0" w:color="8FAADC"/>
+              <w:right w:val="single" w:sz="4" w:space="0" w:color="8FAADC"/>
+            </w:tcBorders>
+          </w:tcPr>
+          <w:p>
+            <w:pPr>
+              <w:jc w:val="center"/>
+            </w:pPr>
+            <w:r/>
+            <w:r>
+              <w:rPr>
+                <w:rFonts w:ascii="Times New Roman" w:hAnsi="Times New Roman" w:eastAsia="黑体" w:cs="Times New Roman"/>
+                <w:b/>
+                <w:color w:val="FFFFFF"/>
+                <w:sz w:val="21"/>
+              </w:rPr>
+              <w:t>操作</w:t>
+            </w:r>
+          </w:p>
+        </w:tc>
+        <w:tc>
+          <w:tcPr>
+            <w:tcW w:type="dxa" w:w="3060"/>
+            <w:shd w:fill="1F4E79" w:val="clear"/>
+            <w:tcBorders>
+              <w:top w:val="single" w:sz="4" w:space="0" w:color="8FAADC"/>
+              <w:left w:val="single" w:sz="4" w:space="0" w:color="8FAADC"/>
+              <w:bottom w:val="single" w:sz="4" w:space="0" w:color="8FAADC"/>
+              <w:right w:val="single" w:sz="4" w:space="0" w:color="8FAADC"/>
+            </w:tcBorders>
+          </w:tcPr>
+          <w:p>
+            <w:pPr>
+              <w:jc w:val="center"/>
+            </w:pPr>
+            <w:r/>
+            <w:r>
+              <w:rPr>
+                <w:rFonts w:ascii="Times New Roman" w:hAnsi="Times New Roman" w:eastAsia="黑体" w:cs="Times New Roman"/>
+                <w:b/>
+                <w:color w:val="FFFFFF"/>
+                <w:sz w:val="21"/>
+              </w:rPr>
+              <w:t>预期</w:t>
+            </w:r>
+          </w:p>
+        </w:tc>
+      </w:tr>
+      <w:tr>
+        <w:tc>
+          <w:tcPr>
+            <w:tcW w:type="dxa" w:w="3060"/>
+            <w:shd w:fill="D6E3F0" w:val="clear"/>
+            <w:tcBorders>
+              <w:top w:val="single" w:sz="4" w:space="0" w:color="8FAADC"/>
+              <w:left w:val="single" w:sz="4" w:space="0" w:color="8FAADC"/>
+              <w:bottom w:val="single" w:sz="4" w:space="0" w:color="8FAADC"/>
+              <w:right w:val="single" w:sz="4" w:space="0" w:color="8FAADC"/>
+            </w:tcBorders>
+          </w:tcPr>
+          <w:p>
+            <w:pPr>
+              <w:spacing w:after="0" w:before="0"/>
+            </w:pPr>
+            <w:r/>
+            <w:r>
+              <w:rPr>
+                <w:rFonts w:ascii="Times New Roman" w:hAnsi="Times New Roman" w:eastAsia="宋体" w:cs="Times New Roman"/>
+                <w:b w:val="0"/>
+                <w:sz w:val="20"/>
+              </w:rPr>
+              <w:t>1</w:t>
+            </w:r>
+          </w:p>
+        </w:tc>
+        <w:tc>
+          <w:tcPr>
+            <w:tcW w:type="dxa" w:w="3060"/>
+            <w:shd w:fill="D6E3F0" w:val="clear"/>
+            <w:tcBorders>
+              <w:top w:val="single" w:sz="4" w:space="0" w:color="8FAADC"/>
+              <w:left w:val="single" w:sz="4" w:space="0" w:color="8FAADC"/>
+              <w:bottom w:val="single" w:sz="4" w:space="0" w:color="8FAADC"/>
+              <w:right w:val="single" w:sz="4" w:space="0" w:color="8FAADC"/>
+            </w:tcBorders>
+          </w:tcPr>
+          <w:p>
+            <w:pPr>
+              <w:spacing w:after="0" w:before="0"/>
+            </w:pPr>
+            <w:r/>
+            <w:r>
+              <w:rPr>
+                <w:rFonts w:ascii="Times New Roman" w:hAnsi="Times New Roman" w:eastAsia="宋体" w:cs="Times New Roman"/>
+                <w:b w:val="0"/>
+                <w:sz w:val="20"/>
+              </w:rPr>
+              <w:t>进入仓库根目录（与 green_power_opt.py、params.py、data/ 同级）</w:t>
+            </w:r>
+          </w:p>
+        </w:tc>
+        <w:tc>
+          <w:tcPr>
+            <w:tcW w:type="dxa" w:w="3060"/>
+            <w:shd w:fill="D6E3F0" w:val="clear"/>
+            <w:tcBorders>
+              <w:top w:val="single" w:sz="4" w:space="0" w:color="8FAADC"/>
+              <w:left w:val="single" w:sz="4" w:space="0" w:color="8FAADC"/>
+              <w:bottom w:val="single" w:sz="4" w:space="0" w:color="8FAADC"/>
+              <w:right w:val="single" w:sz="4" w:space="0" w:color="8FAADC"/>
+            </w:tcBorders>
+          </w:tcPr>
+          <w:p>
+            <w:pPr>
+              <w:spacing w:after="0" w:before="0"/>
+            </w:pPr>
+            <w:r/>
+            <w:r>
+              <w:rPr>
+                <w:rFonts w:ascii="Times New Roman" w:hAnsi="Times New Roman" w:eastAsia="宋体" w:cs="Times New Roman"/>
+                <w:b w:val="0"/>
+                <w:sz w:val="20"/>
+              </w:rPr>
+              <w:t>当前目录能看到这三个路径</w:t>
+            </w:r>
+          </w:p>
+        </w:tc>
+      </w:tr>
+      <w:tr>
+        <w:tc>
+          <w:tcPr>
+            <w:tcW w:type="dxa" w:w="3060"/>
+            <w:shd w:fill="FFFFFF" w:val="clear"/>
+            <w:tcBorders>
+              <w:top w:val="single" w:sz="4" w:space="0" w:color="8FAADC"/>
+              <w:left w:val="single" w:sz="4" w:space="0" w:color="8FAADC"/>
+              <w:bottom w:val="single" w:sz="4" w:space="0" w:color="8FAADC"/>
+              <w:right w:val="single" w:sz="4" w:space="0" w:color="8FAADC"/>
+            </w:tcBorders>
+          </w:tcPr>
+          <w:p>
+            <w:pPr>
+              <w:spacing w:after="0" w:before="0"/>
+            </w:pPr>
+            <w:r/>
+            <w:r>
+              <w:rPr>
+                <w:rFonts w:ascii="Times New Roman" w:hAnsi="Times New Roman" w:eastAsia="宋体" w:cs="Times New Roman"/>
+                <w:b w:val="0"/>
+                <w:sz w:val="20"/>
+              </w:rPr>
+              <w:t>2</w:t>
+            </w:r>
+          </w:p>
+        </w:tc>
+        <w:tc>
+          <w:tcPr>
+            <w:tcW w:type="dxa" w:w="3060"/>
+            <w:shd w:fill="FFFFFF" w:val="clear"/>
+            <w:tcBorders>
+              <w:top w:val="single" w:sz="4" w:space="0" w:color="8FAADC"/>
+              <w:left w:val="single" w:sz="4" w:space="0" w:color="8FAADC"/>
+              <w:bottom w:val="single" w:sz="4" w:space="0" w:color="8FAADC"/>
+              <w:right w:val="single" w:sz="4" w:space="0" w:color="8FAADC"/>
+            </w:tcBorders>
+          </w:tcPr>
+          <w:p>
+            <w:pPr>
+              <w:spacing w:after="0" w:before="0"/>
+            </w:pPr>
+            <w:r/>
+            <w:r>
+              <w:rPr>
+                <w:rFonts w:ascii="Times New Roman" w:hAnsi="Times New Roman" w:eastAsia="宋体" w:cs="Times New Roman"/>
+                <w:b w:val="0"/>
+                <w:sz w:val="20"/>
+              </w:rPr>
+              <w:t>python -c "import gurobipy; print(gurobipy.gurobi.version())"</w:t>
+            </w:r>
+          </w:p>
+        </w:tc>
+        <w:tc>
+          <w:tcPr>
+            <w:tcW w:type="dxa" w:w="3060"/>
+            <w:shd w:fill="FFFFFF" w:val="clear"/>
+            <w:tcBorders>
+              <w:top w:val="single" w:sz="4" w:space="0" w:color="8FAADC"/>
+              <w:left w:val="single" w:sz="4" w:space="0" w:color="8FAADC"/>
+              <w:bottom w:val="single" w:sz="4" w:space="0" w:color="8FAADC"/>
+              <w:right w:val="single" w:sz="4" w:space="0" w:color="8FAADC"/>
+            </w:tcBorders>
+          </w:tcPr>
+          <w:p>
+            <w:pPr>
+              <w:spacing w:after="0" w:before="0"/>
+            </w:pPr>
+            <w:r/>
+            <w:r>
+              <w:rPr>
+                <w:rFonts w:ascii="Times New Roman" w:hAnsi="Times New Roman" w:eastAsia="宋体" w:cs="Times New Roman"/>
+                <w:b w:val="0"/>
+                <w:sz w:val="20"/>
+              </w:rPr>
+              <w:t>打印 Gurobi 版本号；若报 HostID mismatch，换本机非沙箱环境</w:t>
+            </w:r>
+          </w:p>
+        </w:tc>
+      </w:tr>
+      <w:tr>
+        <w:tc>
+          <w:tcPr>
+            <w:tcW w:type="dxa" w:w="3060"/>
+            <w:shd w:fill="D6E3F0" w:val="clear"/>
+            <w:tcBorders>
+              <w:top w:val="single" w:sz="4" w:space="0" w:color="8FAADC"/>
+              <w:left w:val="single" w:sz="4" w:space="0" w:color="8FAADC"/>
+              <w:bottom w:val="single" w:sz="4" w:space="0" w:color="8FAADC"/>
+              <w:right w:val="single" w:sz="4" w:space="0" w:color="8FAADC"/>
+            </w:tcBorders>
+          </w:tcPr>
+          <w:p>
+            <w:pPr>
+              <w:spacing w:after="0" w:before="0"/>
+            </w:pPr>
+            <w:r/>
+            <w:r>
+              <w:rPr>
+                <w:rFonts w:ascii="Times New Roman" w:hAnsi="Times New Roman" w:eastAsia="宋体" w:cs="Times New Roman"/>
+                <w:b w:val="0"/>
+                <w:sz w:val="20"/>
+              </w:rPr>
+              <w:t>3</w:t>
+            </w:r>
+          </w:p>
+        </w:tc>
+        <w:tc>
+          <w:tcPr>
+            <w:tcW w:type="dxa" w:w="3060"/>
+            <w:shd w:fill="D6E3F0" w:val="clear"/>
+            <w:tcBorders>
+              <w:top w:val="single" w:sz="4" w:space="0" w:color="8FAADC"/>
+              <w:left w:val="single" w:sz="4" w:space="0" w:color="8FAADC"/>
+              <w:bottom w:val="single" w:sz="4" w:space="0" w:color="8FAADC"/>
+              <w:right w:val="single" w:sz="4" w:space="0" w:color="8FAADC"/>
+            </w:tcBorders>
+          </w:tcPr>
+          <w:p>
+            <w:pPr>
+              <w:spacing w:after="0" w:before="0"/>
+            </w:pPr>
+            <w:r/>
+            <w:r>
+              <w:rPr>
+                <w:rFonts w:ascii="Times New Roman" w:hAnsi="Times New Roman" w:eastAsia="宋体" w:cs="Times New Roman"/>
+                <w:b w:val="0"/>
+                <w:sz w:val="20"/>
+              </w:rPr>
+              <w:t>python green_power_opt.py --x-gd 60 --mu-re 0</w:t>
+            </w:r>
+          </w:p>
+        </w:tc>
+        <w:tc>
+          <w:tcPr>
+            <w:tcW w:type="dxa" w:w="3060"/>
+            <w:shd w:fill="D6E3F0" w:val="clear"/>
+            <w:tcBorders>
+              <w:top w:val="single" w:sz="4" w:space="0" w:color="8FAADC"/>
+              <w:left w:val="single" w:sz="4" w:space="0" w:color="8FAADC"/>
+              <w:bottom w:val="single" w:sz="4" w:space="0" w:color="8FAADC"/>
+              <w:right w:val="single" w:sz="4" w:space="0" w:color="8FAADC"/>
+            </w:tcBorders>
+          </w:tcPr>
+          <w:p>
+            <w:pPr>
+              <w:spacing w:after="0" w:before="0"/>
+            </w:pPr>
+            <w:r/>
+            <w:r>
+              <w:rPr>
+                <w:rFonts w:ascii="Times New Roman" w:hAnsi="Times New Roman" w:eastAsia="宋体" w:cs="Times New Roman"/>
+                <w:b w:val="0"/>
+                <w:sz w:val="20"/>
+              </w:rPr>
+              <w:t>终端出现 [solve] … -&gt; out/x_gd_60_mu_zero，随后开始建模</w:t>
+            </w:r>
+          </w:p>
+        </w:tc>
+      </w:tr>
+      <w:tr>
+        <w:tc>
+          <w:tcPr>
+            <w:tcW w:type="dxa" w:w="3060"/>
+            <w:shd w:fill="FFFFFF" w:val="clear"/>
+            <w:tcBorders>
+              <w:top w:val="single" w:sz="4" w:space="0" w:color="8FAADC"/>
+              <w:left w:val="single" w:sz="4" w:space="0" w:color="8FAADC"/>
+              <w:bottom w:val="single" w:sz="4" w:space="0" w:color="8FAADC"/>
+              <w:right w:val="single" w:sz="4" w:space="0" w:color="8FAADC"/>
+            </w:tcBorders>
+          </w:tcPr>
+          <w:p>
+            <w:pPr>
+              <w:spacing w:after="0" w:before="0"/>
+            </w:pPr>
+            <w:r/>
+            <w:r>
+              <w:rPr>
+                <w:rFonts w:ascii="Times New Roman" w:hAnsi="Times New Roman" w:eastAsia="宋体" w:cs="Times New Roman"/>
+                <w:b w:val="0"/>
+                <w:sz w:val="20"/>
+              </w:rPr>
+              <w:t>4</w:t>
+            </w:r>
+          </w:p>
+        </w:tc>
+        <w:tc>
+          <w:tcPr>
+            <w:tcW w:type="dxa" w:w="3060"/>
+            <w:shd w:fill="FFFFFF" w:val="clear"/>
+            <w:tcBorders>
+              <w:top w:val="single" w:sz="4" w:space="0" w:color="8FAADC"/>
+              <w:left w:val="single" w:sz="4" w:space="0" w:color="8FAADC"/>
+              <w:bottom w:val="single" w:sz="4" w:space="0" w:color="8FAADC"/>
+              <w:right w:val="single" w:sz="4" w:space="0" w:color="8FAADC"/>
+            </w:tcBorders>
+          </w:tcPr>
+          <w:p>
+            <w:pPr>
+              <w:spacing w:after="0" w:before="0"/>
+            </w:pPr>
+            <w:r/>
+            <w:r>
+              <w:rPr>
+                <w:rFonts w:ascii="Times New Roman" w:hAnsi="Times New Roman" w:eastAsia="宋体" w:cs="Times New Roman"/>
+                <w:b w:val="0"/>
+                <w:sz w:val="20"/>
+              </w:rPr>
+              <w:t>等待求解（8760 h MILP，通常数分钟，默认 MIPGap=1%、时限 300 秒）</w:t>
+            </w:r>
+          </w:p>
+        </w:tc>
+        <w:tc>
+          <w:tcPr>
+            <w:tcW w:type="dxa" w:w="3060"/>
+            <w:shd w:fill="FFFFFF" w:val="clear"/>
+            <w:tcBorders>
+              <w:top w:val="single" w:sz="4" w:space="0" w:color="8FAADC"/>
+              <w:left w:val="single" w:sz="4" w:space="0" w:color="8FAADC"/>
+              <w:bottom w:val="single" w:sz="4" w:space="0" w:color="8FAADC"/>
+              <w:right w:val="single" w:sz="4" w:space="0" w:color="8FAADC"/>
+            </w:tcBorders>
+          </w:tcPr>
+          <w:p>
+            <w:pPr>
+              <w:spacing w:after="0" w:before="0"/>
+            </w:pPr>
+            <w:r/>
+            <w:r>
+              <w:rPr>
+                <w:rFonts w:ascii="Times New Roman" w:hAnsi="Times New Roman" w:eastAsia="宋体" w:cs="Times New Roman"/>
+                <w:b w:val="0"/>
+                <w:sz w:val="20"/>
+              </w:rPr>
+              <w:t>打印 Optimization successful! Results saved to …</w:t>
+            </w:r>
+          </w:p>
+        </w:tc>
+      </w:tr>
+      <w:tr>
+        <w:tc>
+          <w:tcPr>
+            <w:tcW w:type="dxa" w:w="3060"/>
+            <w:shd w:fill="D6E3F0" w:val="clear"/>
+            <w:tcBorders>
+              <w:top w:val="single" w:sz="4" w:space="0" w:color="8FAADC"/>
+              <w:left w:val="single" w:sz="4" w:space="0" w:color="8FAADC"/>
+              <w:bottom w:val="single" w:sz="4" w:space="0" w:color="8FAADC"/>
+              <w:right w:val="single" w:sz="4" w:space="0" w:color="8FAADC"/>
+            </w:tcBorders>
+          </w:tcPr>
+          <w:p>
+            <w:pPr>
+              <w:spacing w:after="0" w:before="0"/>
+            </w:pPr>
+            <w:r/>
+            <w:r>
+              <w:rPr>
+                <w:rFonts w:ascii="Times New Roman" w:hAnsi="Times New Roman" w:eastAsia="宋体" w:cs="Times New Roman"/>
+                <w:b w:val="0"/>
+                <w:sz w:val="20"/>
+              </w:rPr>
+              <w:t>5</w:t>
+            </w:r>
+          </w:p>
+        </w:tc>
+        <w:tc>
+          <w:tcPr>
+            <w:tcW w:type="dxa" w:w="3060"/>
+            <w:shd w:fill="D6E3F0" w:val="clear"/>
+            <w:tcBorders>
+              <w:top w:val="single" w:sz="4" w:space="0" w:color="8FAADC"/>
+              <w:left w:val="single" w:sz="4" w:space="0" w:color="8FAADC"/>
+              <w:bottom w:val="single" w:sz="4" w:space="0" w:color="8FAADC"/>
+              <w:right w:val="single" w:sz="4" w:space="0" w:color="8FAADC"/>
+            </w:tcBorders>
+          </w:tcPr>
+          <w:p>
+            <w:pPr>
+              <w:spacing w:after="0" w:before="0"/>
+            </w:pPr>
+            <w:r/>
+            <w:r>
+              <w:rPr>
+                <w:rFonts w:ascii="Times New Roman" w:hAnsi="Times New Roman" w:eastAsia="宋体" w:cs="Times New Roman"/>
+                <w:b w:val="0"/>
+                <w:sz w:val="20"/>
+              </w:rPr>
+              <w:t>打开 out/x_gd_60_mu_zero/optimization_results.txt</w:t>
+            </w:r>
+          </w:p>
+        </w:tc>
+        <w:tc>
+          <w:tcPr>
+            <w:tcW w:type="dxa" w:w="3060"/>
+            <w:shd w:fill="D6E3F0" w:val="clear"/>
+            <w:tcBorders>
+              <w:top w:val="single" w:sz="4" w:space="0" w:color="8FAADC"/>
+              <w:left w:val="single" w:sz="4" w:space="0" w:color="8FAADC"/>
+              <w:bottom w:val="single" w:sz="4" w:space="0" w:color="8FAADC"/>
+              <w:right w:val="single" w:sz="4" w:space="0" w:color="8FAADC"/>
+            </w:tcBorders>
+          </w:tcPr>
+          <w:p>
+            <w:pPr>
+              <w:spacing w:after="0" w:before="0"/>
+            </w:pPr>
+            <w:r/>
+            <w:r>
+              <w:rPr>
+                <w:rFonts w:ascii="Times New Roman" w:hAnsi="Times New Roman" w:eastAsia="宋体" w:cs="Times New Roman"/>
+                <w:b w:val="0"/>
+                <w:sz w:val="20"/>
+              </w:rPr>
+              <w:t>Status 为 OPTIMAL（或 UNFINISHED 但已有可行解）</w:t>
+            </w:r>
+          </w:p>
+        </w:tc>
+      </w:tr>
+    </w:tbl>
+    <w:p>
+      <w:pPr>
+        <w:spacing w:after="80"/>
+      </w:pPr>
+    </w:p>
+    <w:p>
+      <w:pPr>
+        <w:spacing w:after="120" w:before="0" w:line="360" w:lineRule="auto"/>
+        <w:ind w:firstLine="420"/>
+      </w:pPr>
+      <w:r>
+        <w:rPr>
+          <w:rFonts w:ascii="Times New Roman" w:hAnsi="Times New Roman" w:eastAsia="宋体" w:cs="Times New Roman"/>
+          <w:b w:val="0"/>
+          <w:sz w:val="24"/>
+        </w:rPr>
+        <w:t>完整命令与默认输出位置：</w:t>
+      </w:r>
+    </w:p>
+    <w:p>
+      <w:pPr>
+        <w:spacing w:after="160" w:before="0" w:line="276" w:lineRule="auto"/>
+        <w:ind w:firstLine="0"/>
+        <w:shd w:fill="F2F2F2" w:val="clear"/>
+      </w:pPr>
+      <w:r>
+        <w:rPr>
+          <w:rFonts w:ascii="Consolas" w:hAnsi="Consolas" w:eastAsia="宋体" w:cs="Consolas"/>
+          <w:b w:val="0"/>
+          <w:sz w:val="19"/>
+        </w:rPr>
+        <w:t>cd /path/to/greenpower</w:t>
+        <w:br/>
+        <w:t>python green_power_opt.py --x-gd 60 --mu-re 0</w:t>
+        <w:br/>
+        <w:br/>
+        <w:t># 结果目录（自动创建，不入库）</w:t>
+        <w:br/>
+        <w:t>out/x_gd_60_mu_zero/optimization_results.txt</w:t>
+        <w:br/>
+        <w:t>out/x_gd_60_mu_zero/timeseries_results.csv</w:t>
+      </w:r>
+    </w:p>
+    <w:p>
+      <w:pPr>
+        <w:pStyle w:val="Heading3"/>
+        <w:spacing w:before="160" w:after="120"/>
+        <w:ind w:firstLine="0"/>
+      </w:pPr>
+      <w:r>
+        <w:rPr>
+          <w:rFonts w:ascii="Arial" w:hAnsi="Arial" w:eastAsia="黑体" w:cs="Arial"/>
+          <w:b/>
+          <w:color w:val="1F4E79"/>
+          <w:sz w:val="24"/>
+        </w:rPr>
+        <w:t>这条命令在算什么</w:t>
+      </w:r>
+    </w:p>
+    <w:p>
+      <w:pPr>
+        <w:spacing w:after="120" w:before="0" w:line="360" w:lineRule="auto"/>
+        <w:ind w:firstLine="420"/>
+      </w:pPr>
+      <w:r>
+        <w:rPr>
+          <w:rFonts w:ascii="Times New Roman" w:hAnsi="Times New Roman" w:eastAsia="宋体" w:cs="Times New Roman"/>
+          <w:b w:val="0"/>
+          <w:sz w:val="24"/>
+        </w:rPr>
+        <w:t>--x-gd 60：变压器容量锁死为 60 MW，只优化风电、光伏、储能三类装机。--mu-re 0：把风光内部转移价设为 0 元/kWh（模型内部为 0 万元/MWh）。未写 --phi / --theta / --r0，因此政策下限和投资年化都用 params.py 默认值。未写 --out，程序按规则把结果写到 out/x_gd_60_mu_zero/。</w:t>
+      </w:r>
+    </w:p>
+    <w:p>
+      <w:pPr>
+        <w:pStyle w:val="Heading3"/>
+        <w:spacing w:before="160" w:after="120"/>
+        <w:ind w:firstLine="0"/>
+      </w:pPr>
+      <w:r>
+        <w:rPr>
+          <w:rFonts w:ascii="Arial" w:hAnsi="Arial" w:eastAsia="黑体" w:cs="Arial"/>
+          <w:b/>
+          <w:color w:val="1F4E79"/>
+          <w:sz w:val="24"/>
+        </w:rPr>
+        <w:t>跑通后先看这几行</w:t>
+      </w:r>
+    </w:p>
+    <w:p>
+      <w:pPr>
+        <w:spacing w:after="120" w:before="0" w:line="360" w:lineRule="auto"/>
+        <w:ind w:firstLine="420"/>
+      </w:pPr>
+      <w:r>
+        <w:rPr>
+          <w:rFonts w:ascii="Times New Roman" w:hAnsi="Times New Roman" w:eastAsia="宋体" w:cs="Times New Roman"/>
+          <w:b w:val="0"/>
+          <w:sz w:val="24"/>
+        </w:rPr>
+        <w:t>打开 optimization_results.txt，按下面顺序确认案例是否成功。第 6 节有全部字段释义。</w:t>
+      </w:r>
+    </w:p>
+    <w:tbl>
+      <w:tblPr>
+        <w:tblW w:type="auto" w:w="0"/>
+        <w:jc w:val="center"/>
+        <w:tblLook w:firstColumn="1" w:firstRow="1" w:lastColumn="0" w:lastRow="0" w:noHBand="0" w:noVBand="1" w:val="04A0"/>
+      </w:tblPr>
+      <w:tblGrid>
+        <w:gridCol w:w="3060"/>
+        <w:gridCol w:w="3060"/>
+        <w:gridCol w:w="3060"/>
+      </w:tblGrid>
+      <w:tr>
+        <w:tc>
+          <w:tcPr>
+            <w:tcW w:type="dxa" w:w="3060"/>
+            <w:shd w:fill="1F4E79" w:val="clear"/>
+            <w:tcBorders>
+              <w:top w:val="single" w:sz="4" w:space="0" w:color="8FAADC"/>
+              <w:left w:val="single" w:sz="4" w:space="0" w:color="8FAADC"/>
+              <w:bottom w:val="single" w:sz="4" w:space="0" w:color="8FAADC"/>
+              <w:right w:val="single" w:sz="4" w:space="0" w:color="8FAADC"/>
+            </w:tcBorders>
+          </w:tcPr>
+          <w:p>
+            <w:pPr>
+              <w:jc w:val="center"/>
+            </w:pPr>
+            <w:r/>
+            <w:r>
+              <w:rPr>
+                <w:rFonts w:ascii="Times New Roman" w:hAnsi="Times New Roman" w:eastAsia="黑体" w:cs="Times New Roman"/>
+                <w:b/>
+                <w:color w:val="FFFFFF"/>
+                <w:sz w:val="21"/>
+              </w:rPr>
+              <w:t>先看</w:t>
+            </w:r>
+          </w:p>
+        </w:tc>
+        <w:tc>
+          <w:tcPr>
+            <w:tcW w:type="dxa" w:w="3060"/>
+            <w:shd w:fill="1F4E79" w:val="clear"/>
+            <w:tcBorders>
+              <w:top w:val="single" w:sz="4" w:space="0" w:color="8FAADC"/>
+              <w:left w:val="single" w:sz="4" w:space="0" w:color="8FAADC"/>
+              <w:bottom w:val="single" w:sz="4" w:space="0" w:color="8FAADC"/>
+              <w:right w:val="single" w:sz="4" w:space="0" w:color="8FAADC"/>
+            </w:tcBorders>
+          </w:tcPr>
+          <w:p>
+            <w:pPr>
+              <w:jc w:val="center"/>
+            </w:pPr>
+            <w:r/>
+            <w:r>
+              <w:rPr>
+                <w:rFonts w:ascii="Times New Roman" w:hAnsi="Times New Roman" w:eastAsia="黑体" w:cs="Times New Roman"/>
+                <w:b/>
+                <w:color w:val="FFFFFF"/>
+                <w:sz w:val="21"/>
+              </w:rPr>
+              <w:t>示例（μ=0、变压器 60 MW 的一次求解）</w:t>
+            </w:r>
+          </w:p>
+        </w:tc>
+        <w:tc>
+          <w:tcPr>
+            <w:tcW w:type="dxa" w:w="3060"/>
+            <w:shd w:fill="1F4E79" w:val="clear"/>
+            <w:tcBorders>
+              <w:top w:val="single" w:sz="4" w:space="0" w:color="8FAADC"/>
+              <w:left w:val="single" w:sz="4" w:space="0" w:color="8FAADC"/>
+              <w:bottom w:val="single" w:sz="4" w:space="0" w:color="8FAADC"/>
+              <w:right w:val="single" w:sz="4" w:space="0" w:color="8FAADC"/>
+            </w:tcBorders>
+          </w:tcPr>
+          <w:p>
+            <w:pPr>
+              <w:jc w:val="center"/>
+            </w:pPr>
+            <w:r/>
+            <w:r>
+              <w:rPr>
+                <w:rFonts w:ascii="Times New Roman" w:hAnsi="Times New Roman" w:eastAsia="黑体" w:cs="Times New Roman"/>
+                <w:b/>
+                <w:color w:val="FFFFFF"/>
+                <w:sz w:val="21"/>
+              </w:rPr>
+              <w:t>含义</w:t>
+            </w:r>
+          </w:p>
+        </w:tc>
+      </w:tr>
+      <w:tr>
+        <w:tc>
+          <w:tcPr>
+            <w:tcW w:type="dxa" w:w="3060"/>
+            <w:shd w:fill="D6E3F0" w:val="clear"/>
+            <w:tcBorders>
+              <w:top w:val="single" w:sz="4" w:space="0" w:color="8FAADC"/>
+              <w:left w:val="single" w:sz="4" w:space="0" w:color="8FAADC"/>
+              <w:bottom w:val="single" w:sz="4" w:space="0" w:color="8FAADC"/>
+              <w:right w:val="single" w:sz="4" w:space="0" w:color="8FAADC"/>
+            </w:tcBorders>
+          </w:tcPr>
+          <w:p>
+            <w:pPr>
+              <w:spacing w:after="0" w:before="0"/>
+            </w:pPr>
+            <w:r/>
+            <w:r>
+              <w:rPr>
+                <w:rFonts w:ascii="Times New Roman" w:hAnsi="Times New Roman" w:eastAsia="宋体" w:cs="Times New Roman"/>
+                <w:b w:val="0"/>
+                <w:sz w:val="20"/>
+              </w:rPr>
+              <w:t>Status</w:t>
+            </w:r>
+          </w:p>
+        </w:tc>
+        <w:tc>
+          <w:tcPr>
+            <w:tcW w:type="dxa" w:w="3060"/>
+            <w:shd w:fill="D6E3F0" w:val="clear"/>
+            <w:tcBorders>
+              <w:top w:val="single" w:sz="4" w:space="0" w:color="8FAADC"/>
+              <w:left w:val="single" w:sz="4" w:space="0" w:color="8FAADC"/>
+              <w:bottom w:val="single" w:sz="4" w:space="0" w:color="8FAADC"/>
+              <w:right w:val="single" w:sz="4" w:space="0" w:color="8FAADC"/>
+            </w:tcBorders>
+          </w:tcPr>
+          <w:p>
+            <w:pPr>
+              <w:spacing w:after="0" w:before="0"/>
+            </w:pPr>
+            <w:r/>
+            <w:r>
+              <w:rPr>
+                <w:rFonts w:ascii="Times New Roman" w:hAnsi="Times New Roman" w:eastAsia="宋体" w:cs="Times New Roman"/>
+                <w:b w:val="0"/>
+                <w:sz w:val="20"/>
+              </w:rPr>
+              <w:t>OPTIMAL</w:t>
+            </w:r>
+          </w:p>
+        </w:tc>
+        <w:tc>
+          <w:tcPr>
+            <w:tcW w:type="dxa" w:w="3060"/>
+            <w:shd w:fill="D6E3F0" w:val="clear"/>
+            <w:tcBorders>
+              <w:top w:val="single" w:sz="4" w:space="0" w:color="8FAADC"/>
+              <w:left w:val="single" w:sz="4" w:space="0" w:color="8FAADC"/>
+              <w:bottom w:val="single" w:sz="4" w:space="0" w:color="8FAADC"/>
+              <w:right w:val="single" w:sz="4" w:space="0" w:color="8FAADC"/>
+            </w:tcBorders>
+          </w:tcPr>
+          <w:p>
+            <w:pPr>
+              <w:spacing w:after="0" w:before="0"/>
+            </w:pPr>
+            <w:r/>
+            <w:r>
+              <w:rPr>
+                <w:rFonts w:ascii="Times New Roman" w:hAnsi="Times New Roman" w:eastAsia="宋体" w:cs="Times New Roman"/>
+                <w:b w:val="0"/>
+                <w:sz w:val="20"/>
+              </w:rPr>
+              <w:t>已在 1% MIPGap 内得到可接受最优解</w:t>
+            </w:r>
+          </w:p>
+        </w:tc>
+      </w:tr>
+      <w:tr>
+        <w:tc>
+          <w:tcPr>
+            <w:tcW w:type="dxa" w:w="3060"/>
+            <w:shd w:fill="FFFFFF" w:val="clear"/>
+            <w:tcBorders>
+              <w:top w:val="single" w:sz="4" w:space="0" w:color="8FAADC"/>
+              <w:left w:val="single" w:sz="4" w:space="0" w:color="8FAADC"/>
+              <w:bottom w:val="single" w:sz="4" w:space="0" w:color="8FAADC"/>
+              <w:right w:val="single" w:sz="4" w:space="0" w:color="8FAADC"/>
+            </w:tcBorders>
+          </w:tcPr>
+          <w:p>
+            <w:pPr>
+              <w:spacing w:after="0" w:before="0"/>
+            </w:pPr>
+            <w:r/>
+            <w:r>
+              <w:rPr>
+                <w:rFonts w:ascii="Times New Roman" w:hAnsi="Times New Roman" w:eastAsia="宋体" w:cs="Times New Roman"/>
+                <w:b w:val="0"/>
+                <w:sz w:val="20"/>
+              </w:rPr>
+              <w:t>Total Annualized Objective</w:t>
+            </w:r>
+          </w:p>
+        </w:tc>
+        <w:tc>
+          <w:tcPr>
+            <w:tcW w:type="dxa" w:w="3060"/>
+            <w:shd w:fill="FFFFFF" w:val="clear"/>
+            <w:tcBorders>
+              <w:top w:val="single" w:sz="4" w:space="0" w:color="8FAADC"/>
+              <w:left w:val="single" w:sz="4" w:space="0" w:color="8FAADC"/>
+              <w:bottom w:val="single" w:sz="4" w:space="0" w:color="8FAADC"/>
+              <w:right w:val="single" w:sz="4" w:space="0" w:color="8FAADC"/>
+            </w:tcBorders>
+          </w:tcPr>
+          <w:p>
+            <w:pPr>
+              <w:spacing w:after="0" w:before="0"/>
+            </w:pPr>
+            <w:r/>
+            <w:r>
+              <w:rPr>
+                <w:rFonts w:ascii="Times New Roman" w:hAnsi="Times New Roman" w:eastAsia="宋体"/>
+                <w:b w:val="0"/>
+                <w:sz w:val="20"/>
+              </w:rPr>
+              <w:t>约 17892 万元/年</w:t>
+            </w:r>
+          </w:p>
+        </w:tc>
+        <w:tc>
+          <w:tcPr>
+            <w:tcW w:type="dxa" w:w="3060"/>
+            <w:shd w:fill="FFFFFF" w:val="clear"/>
+            <w:tcBorders>
+              <w:top w:val="single" w:sz="4" w:space="0" w:color="8FAADC"/>
+              <w:left w:val="single" w:sz="4" w:space="0" w:color="8FAADC"/>
+              <w:bottom w:val="single" w:sz="4" w:space="0" w:color="8FAADC"/>
+              <w:right w:val="single" w:sz="4" w:space="0" w:color="8FAADC"/>
+            </w:tcBorders>
+          </w:tcPr>
+          <w:p>
+            <w:pPr>
+              <w:spacing w:after="0" w:before="0"/>
+            </w:pPr>
+            <w:r/>
+            <w:r>
+              <w:rPr>
+                <w:rFonts w:ascii="Times New Roman" w:hAnsi="Times New Roman" w:eastAsia="宋体" w:cs="Times New Roman"/>
+                <w:b w:val="0"/>
+                <w:sz w:val="20"/>
+              </w:rPr>
+              <w:t>年化综合成本 J，越小越好</w:t>
+            </w:r>
+          </w:p>
+        </w:tc>
+      </w:tr>
+      <w:tr>
+        <w:tc>
+          <w:tcPr>
+            <w:tcW w:type="dxa" w:w="3060"/>
+            <w:shd w:fill="D6E3F0" w:val="clear"/>
+            <w:tcBorders>
+              <w:top w:val="single" w:sz="4" w:space="0" w:color="8FAADC"/>
+              <w:left w:val="single" w:sz="4" w:space="0" w:color="8FAADC"/>
+              <w:bottom w:val="single" w:sz="4" w:space="0" w:color="8FAADC"/>
+              <w:right w:val="single" w:sz="4" w:space="0" w:color="8FAADC"/>
+            </w:tcBorders>
+          </w:tcPr>
+          <w:p>
+            <w:pPr>
+              <w:spacing w:after="0" w:before="0"/>
+            </w:pPr>
+            <w:r/>
+            <w:r>
+              <w:rPr>
+                <w:rFonts w:ascii="Times New Roman" w:hAnsi="Times New Roman" w:eastAsia="宋体" w:cs="Times New Roman"/>
+                <w:b w:val="0"/>
+                <w:sz w:val="20"/>
+              </w:rPr>
+              <w:t>x_WT / x_PV / x_ST / x_GD</w:t>
+            </w:r>
+          </w:p>
+        </w:tc>
+        <w:tc>
+          <w:tcPr>
+            <w:tcW w:type="dxa" w:w="3060"/>
+            <w:shd w:fill="D6E3F0" w:val="clear"/>
+            <w:tcBorders>
+              <w:top w:val="single" w:sz="4" w:space="0" w:color="8FAADC"/>
+              <w:left w:val="single" w:sz="4" w:space="0" w:color="8FAADC"/>
+              <w:bottom w:val="single" w:sz="4" w:space="0" w:color="8FAADC"/>
+              <w:right w:val="single" w:sz="4" w:space="0" w:color="8FAADC"/>
+            </w:tcBorders>
+          </w:tcPr>
+          <w:p>
+            <w:pPr>
+              <w:spacing w:after="0" w:before="0"/>
+            </w:pPr>
+            <w:r/>
+            <w:r>
+              <w:rPr>
+                <w:rFonts w:ascii="Times New Roman" w:hAnsi="Times New Roman" w:eastAsia="宋体" w:cs="Times New Roman"/>
+                <w:b w:val="0"/>
+                <w:sz w:val="20"/>
+              </w:rPr>
+              <w:t>约 43.12 MW / 137.50 MW / 218.93 MWh / 60 MW</w:t>
+            </w:r>
+          </w:p>
+        </w:tc>
+        <w:tc>
+          <w:tcPr>
+            <w:tcW w:type="dxa" w:w="3060"/>
+            <w:shd w:fill="D6E3F0" w:val="clear"/>
+            <w:tcBorders>
+              <w:top w:val="single" w:sz="4" w:space="0" w:color="8FAADC"/>
+              <w:left w:val="single" w:sz="4" w:space="0" w:color="8FAADC"/>
+              <w:bottom w:val="single" w:sz="4" w:space="0" w:color="8FAADC"/>
+              <w:right w:val="single" w:sz="4" w:space="0" w:color="8FAADC"/>
+            </w:tcBorders>
+          </w:tcPr>
+          <w:p>
+            <w:pPr>
+              <w:spacing w:after="0" w:before="0"/>
+            </w:pPr>
+            <w:r/>
+            <w:r>
+              <w:rPr>
+                <w:rFonts w:ascii="Times New Roman" w:hAnsi="Times New Roman" w:eastAsia="宋体" w:cs="Times New Roman"/>
+                <w:b w:val="0"/>
+                <w:sz w:val="20"/>
+              </w:rPr>
+              <w:t>最优装机；光伏常顶到占地 137.5 MW</w:t>
+            </w:r>
+          </w:p>
+        </w:tc>
+      </w:tr>
+      <w:tr>
+        <w:tc>
+          <w:tcPr>
+            <w:tcW w:type="dxa" w:w="3060"/>
+            <w:shd w:fill="FFFFFF" w:val="clear"/>
+            <w:tcBorders>
+              <w:top w:val="single" w:sz="4" w:space="0" w:color="8FAADC"/>
+              <w:left w:val="single" w:sz="4" w:space="0" w:color="8FAADC"/>
+              <w:bottom w:val="single" w:sz="4" w:space="0" w:color="8FAADC"/>
+              <w:right w:val="single" w:sz="4" w:space="0" w:color="8FAADC"/>
+            </w:tcBorders>
+          </w:tcPr>
+          <w:p>
+            <w:pPr>
+              <w:spacing w:after="0" w:before="0"/>
+            </w:pPr>
+            <w:r/>
+            <w:r>
+              <w:rPr>
+                <w:rFonts w:ascii="Times New Roman" w:hAnsi="Times New Roman" w:eastAsia="宋体" w:cs="Times New Roman"/>
+                <w:b w:val="0"/>
+                <w:sz w:val="20"/>
+              </w:rPr>
+              <w:t>Unit Electricity Cost</w:t>
+            </w:r>
+          </w:p>
+        </w:tc>
+        <w:tc>
+          <w:tcPr>
+            <w:tcW w:type="dxa" w:w="3060"/>
+            <w:shd w:fill="FFFFFF" w:val="clear"/>
+            <w:tcBorders>
+              <w:top w:val="single" w:sz="4" w:space="0" w:color="8FAADC"/>
+              <w:left w:val="single" w:sz="4" w:space="0" w:color="8FAADC"/>
+              <w:bottom w:val="single" w:sz="4" w:space="0" w:color="8FAADC"/>
+              <w:right w:val="single" w:sz="4" w:space="0" w:color="8FAADC"/>
+            </w:tcBorders>
+          </w:tcPr>
+          <w:p>
+            <w:pPr>
+              <w:spacing w:after="0" w:before="0"/>
+            </w:pPr>
+            <w:r/>
+            <w:r>
+              <w:rPr>
+                <w:rFonts w:ascii="Times New Roman" w:hAnsi="Times New Roman" w:eastAsia="宋体" w:cs="Times New Roman"/>
+                <w:b w:val="0"/>
+                <w:sz w:val="20"/>
+              </w:rPr>
+              <w:t>约 0.52 元/kWh</w:t>
+            </w:r>
+          </w:p>
+        </w:tc>
+        <w:tc>
+          <w:tcPr>
+            <w:tcW w:type="dxa" w:w="3060"/>
+            <w:shd w:fill="FFFFFF" w:val="clear"/>
+            <w:tcBorders>
+              <w:top w:val="single" w:sz="4" w:space="0" w:color="8FAADC"/>
+              <w:left w:val="single" w:sz="4" w:space="0" w:color="8FAADC"/>
+              <w:bottom w:val="single" w:sz="4" w:space="0" w:color="8FAADC"/>
+              <w:right w:val="single" w:sz="4" w:space="0" w:color="8FAADC"/>
+            </w:tcBorders>
+          </w:tcPr>
+          <w:p>
+            <w:pPr>
+              <w:spacing w:after="0" w:before="0"/>
+            </w:pPr>
+            <w:r/>
+            <w:r>
+              <w:rPr>
+                <w:rFonts w:ascii="Times New Roman" w:hAnsi="Times New Roman" w:eastAsia="宋体" w:cs="Times New Roman"/>
+                <w:b w:val="0"/>
+                <w:sz w:val="20"/>
+              </w:rPr>
+              <w:t>度电成本 = J / 年用电量</w:t>
+            </w:r>
+          </w:p>
+        </w:tc>
+      </w:tr>
+      <w:tr>
+        <w:tc>
+          <w:tcPr>
+            <w:tcW w:type="dxa" w:w="3060"/>
+            <w:shd w:fill="D6E3F0" w:val="clear"/>
+            <w:tcBorders>
+              <w:top w:val="single" w:sz="4" w:space="0" w:color="8FAADC"/>
+              <w:left w:val="single" w:sz="4" w:space="0" w:color="8FAADC"/>
+              <w:bottom w:val="single" w:sz="4" w:space="0" w:color="8FAADC"/>
+              <w:right w:val="single" w:sz="4" w:space="0" w:color="8FAADC"/>
+            </w:tcBorders>
+          </w:tcPr>
+          <w:p>
+            <w:pPr>
+              <w:spacing w:after="0" w:before="0"/>
+            </w:pPr>
+            <w:r/>
+            <w:r>
+              <w:rPr>
+                <w:rFonts w:ascii="Times New Roman" w:hAnsi="Times New Roman" w:eastAsia="宋体" w:cs="Times New Roman"/>
+                <w:b w:val="0"/>
+                <w:sz w:val="20"/>
+              </w:rPr>
+              <w:t>余电上网比例</w:t>
+            </w:r>
+          </w:p>
+        </w:tc>
+        <w:tc>
+          <w:tcPr>
+            <w:tcW w:type="dxa" w:w="3060"/>
+            <w:shd w:fill="D6E3F0" w:val="clear"/>
+            <w:tcBorders>
+              <w:top w:val="single" w:sz="4" w:space="0" w:color="8FAADC"/>
+              <w:left w:val="single" w:sz="4" w:space="0" w:color="8FAADC"/>
+              <w:bottom w:val="single" w:sz="4" w:space="0" w:color="8FAADC"/>
+              <w:right w:val="single" w:sz="4" w:space="0" w:color="8FAADC"/>
+            </w:tcBorders>
+          </w:tcPr>
+          <w:p>
+            <w:pPr>
+              <w:spacing w:after="0" w:before="0"/>
+            </w:pPr>
+            <w:r/>
+            <w:r>
+              <w:rPr>
+                <w:rFonts w:ascii="Times New Roman" w:hAnsi="Times New Roman" w:eastAsia="宋体" w:cs="Times New Roman"/>
+                <w:b w:val="0"/>
+                <w:sz w:val="20"/>
+              </w:rPr>
+              <w:t>约 0.20</w:t>
+            </w:r>
+          </w:p>
+        </w:tc>
+        <w:tc>
+          <w:tcPr>
+            <w:tcW w:type="dxa" w:w="3060"/>
+            <w:shd w:fill="D6E3F0" w:val="clear"/>
+            <w:tcBorders>
+              <w:top w:val="single" w:sz="4" w:space="0" w:color="8FAADC"/>
+              <w:left w:val="single" w:sz="4" w:space="0" w:color="8FAADC"/>
+              <w:bottom w:val="single" w:sz="4" w:space="0" w:color="8FAADC"/>
+              <w:right w:val="single" w:sz="4" w:space="0" w:color="8FAADC"/>
+            </w:tcBorders>
+          </w:tcPr>
+          <w:p>
+            <w:pPr>
+              <w:spacing w:after="0" w:before="0"/>
+            </w:pPr>
+            <w:r/>
+            <w:r>
+              <w:rPr>
+                <w:rFonts w:ascii="Times New Roman" w:hAnsi="Times New Roman" w:eastAsia="宋体" w:cs="Times New Roman"/>
+                <w:b w:val="0"/>
+                <w:sz w:val="20"/>
+              </w:rPr>
+              <w:t>贴着 ψ=20% 上限，说明上网约束起作用</w:t>
+            </w:r>
+          </w:p>
+        </w:tc>
+      </w:tr>
+      <w:tr>
+        <w:tc>
+          <w:tcPr>
+            <w:tcW w:type="dxa" w:w="3060"/>
+            <w:shd w:fill="FFFFFF" w:val="clear"/>
+            <w:tcBorders>
+              <w:top w:val="single" w:sz="4" w:space="0" w:color="8FAADC"/>
+              <w:left w:val="single" w:sz="4" w:space="0" w:color="8FAADC"/>
+              <w:bottom w:val="single" w:sz="4" w:space="0" w:color="8FAADC"/>
+              <w:right w:val="single" w:sz="4" w:space="0" w:color="8FAADC"/>
+            </w:tcBorders>
+          </w:tcPr>
+          <w:p>
+            <w:pPr>
+              <w:spacing w:after="0" w:before="0"/>
+            </w:pPr>
+            <w:r/>
+            <w:r>
+              <w:rPr>
+                <w:rFonts w:ascii="Times New Roman" w:hAnsi="Times New Roman" w:eastAsia="宋体" w:cs="Times New Roman"/>
+                <w:b w:val="0"/>
+                <w:sz w:val="20"/>
+              </w:rPr>
+              <w:t>自发自用比例</w:t>
+            </w:r>
+          </w:p>
+        </w:tc>
+        <w:tc>
+          <w:tcPr>
+            <w:tcW w:type="dxa" w:w="3060"/>
+            <w:shd w:fill="FFFFFF" w:val="clear"/>
+            <w:tcBorders>
+              <w:top w:val="single" w:sz="4" w:space="0" w:color="8FAADC"/>
+              <w:left w:val="single" w:sz="4" w:space="0" w:color="8FAADC"/>
+              <w:bottom w:val="single" w:sz="4" w:space="0" w:color="8FAADC"/>
+              <w:right w:val="single" w:sz="4" w:space="0" w:color="8FAADC"/>
+            </w:tcBorders>
+          </w:tcPr>
+          <w:p>
+            <w:pPr>
+              <w:spacing w:after="0" w:before="0"/>
+            </w:pPr>
+            <w:r/>
+            <w:r>
+              <w:rPr>
+                <w:rFonts w:ascii="Times New Roman" w:hAnsi="Times New Roman" w:eastAsia="宋体" w:cs="Times New Roman"/>
+                <w:b w:val="0"/>
+                <w:sz w:val="20"/>
+              </w:rPr>
+              <w:t>约 0.80</w:t>
+            </w:r>
+          </w:p>
+        </w:tc>
+        <w:tc>
+          <w:tcPr>
+            <w:tcW w:type="dxa" w:w="3060"/>
+            <w:shd w:fill="FFFFFF" w:val="clear"/>
+            <w:tcBorders>
+              <w:top w:val="single" w:sz="4" w:space="0" w:color="8FAADC"/>
+              <w:left w:val="single" w:sz="4" w:space="0" w:color="8FAADC"/>
+              <w:bottom w:val="single" w:sz="4" w:space="0" w:color="8FAADC"/>
+              <w:right w:val="single" w:sz="4" w:space="0" w:color="8FAADC"/>
+            </w:tcBorders>
+          </w:tcPr>
+          <w:p>
+            <w:pPr>
+              <w:spacing w:after="0" w:before="0"/>
+            </w:pPr>
+            <w:r/>
+            <w:r>
+              <w:rPr>
+                <w:rFonts w:ascii="Times New Roman" w:hAnsi="Times New Roman" w:eastAsia="宋体" w:cs="Times New Roman"/>
+                <w:b w:val="0"/>
+                <w:sz w:val="20"/>
+              </w:rPr>
+              <w:t>高于 φ=60% 下限</w:t>
+            </w:r>
+          </w:p>
+        </w:tc>
+      </w:tr>
+      <w:tr>
+        <w:tc>
+          <w:tcPr>
+            <w:tcW w:type="dxa" w:w="3060"/>
+            <w:shd w:fill="D6E3F0" w:val="clear"/>
+            <w:tcBorders>
+              <w:top w:val="single" w:sz="4" w:space="0" w:color="8FAADC"/>
+              <w:left w:val="single" w:sz="4" w:space="0" w:color="8FAADC"/>
+              <w:bottom w:val="single" w:sz="4" w:space="0" w:color="8FAADC"/>
+              <w:right w:val="single" w:sz="4" w:space="0" w:color="8FAADC"/>
+            </w:tcBorders>
+          </w:tcPr>
+          <w:p>
+            <w:pPr>
+              <w:spacing w:after="0" w:before="0"/>
+            </w:pPr>
+            <w:r/>
+            <w:r>
+              <w:rPr>
+                <w:rFonts w:ascii="Times New Roman" w:hAnsi="Times New Roman" w:eastAsia="宋体" w:cs="Times New Roman"/>
+                <w:b w:val="0"/>
+                <w:sz w:val="20"/>
+              </w:rPr>
+              <w:t>绿电使用占比</w:t>
+            </w:r>
+          </w:p>
+        </w:tc>
+        <w:tc>
+          <w:tcPr>
+            <w:tcW w:type="dxa" w:w="3060"/>
+            <w:shd w:fill="D6E3F0" w:val="clear"/>
+            <w:tcBorders>
+              <w:top w:val="single" w:sz="4" w:space="0" w:color="8FAADC"/>
+              <w:left w:val="single" w:sz="4" w:space="0" w:color="8FAADC"/>
+              <w:bottom w:val="single" w:sz="4" w:space="0" w:color="8FAADC"/>
+              <w:right w:val="single" w:sz="4" w:space="0" w:color="8FAADC"/>
+            </w:tcBorders>
+          </w:tcPr>
+          <w:p>
+            <w:pPr>
+              <w:spacing w:after="0" w:before="0"/>
+            </w:pPr>
+            <w:r/>
+            <w:r>
+              <w:rPr>
+                <w:rFonts w:ascii="Times New Roman" w:hAnsi="Times New Roman" w:eastAsia="宋体" w:cs="Times New Roman"/>
+                <w:b w:val="0"/>
+                <w:sz w:val="20"/>
+              </w:rPr>
+              <w:t>约 0.87</w:t>
+            </w:r>
+          </w:p>
+        </w:tc>
+        <w:tc>
+          <w:tcPr>
+            <w:tcW w:type="dxa" w:w="3060"/>
+            <w:shd w:fill="D6E3F0" w:val="clear"/>
+            <w:tcBorders>
+              <w:top w:val="single" w:sz="4" w:space="0" w:color="8FAADC"/>
+              <w:left w:val="single" w:sz="4" w:space="0" w:color="8FAADC"/>
+              <w:bottom w:val="single" w:sz="4" w:space="0" w:color="8FAADC"/>
+              <w:right w:val="single" w:sz="4" w:space="0" w:color="8FAADC"/>
+            </w:tcBorders>
+          </w:tcPr>
+          <w:p>
+            <w:pPr>
+              <w:spacing w:after="0" w:before="0"/>
+            </w:pPr>
+            <w:r/>
+            <w:r>
+              <w:rPr>
+                <w:rFonts w:ascii="Times New Roman" w:hAnsi="Times New Roman" w:eastAsia="宋体" w:cs="Times New Roman"/>
+                <w:b w:val="0"/>
+                <w:sz w:val="20"/>
+              </w:rPr>
+              <w:t>年风光发电 / 年用电，高于 θ=30%</w:t>
+            </w:r>
+          </w:p>
+        </w:tc>
+      </w:tr>
+    </w:tbl>
+    <w:p>
+      <w:pPr>
+        <w:spacing w:after="80"/>
+      </w:pPr>
+    </w:p>
+    <w:p>
+      <w:pPr>
+        <w:spacing w:after="120" w:before="0" w:line="360" w:lineRule="auto"/>
+        <w:ind w:firstLine="420"/>
+      </w:pPr>
+      <w:r>
+        <w:rPr>
+          <w:rFonts w:ascii="Times New Roman" w:hAnsi="Times New Roman" w:eastAsia="宋体" w:cs="Times New Roman"/>
+          <w:b w:val="0"/>
+          <w:sz w:val="24"/>
+        </w:rPr>
+        <w:t>timeseries_results.csv 用于抽查逐时功率。任取一行应满足：P_WT + P_PV − P_ST_Charge + P_ST_Discharge + P_Grid_Buy − P_Grid_Sell = Load。若 Status 不是 OPTIMAL 但仍写出结果，表示到时限已有可行方案，容量仍可参考，只是未证明全局最优。若目录里出现 model.ilp 而没有上述两个文件，说明当前参数下模型不可行，需放宽 φ/θ 或增大占地、变压器等。</w:t>
+      </w:r>
+    </w:p>
+    <w:p>
+      <w:pPr>
+        <w:spacing w:after="120" w:before="0" w:line="360" w:lineRule="auto"/>
+        <w:ind w:firstLine="420"/>
+      </w:pPr>
+      <w:r>
+        <w:rPr>
+          <w:rFonts w:ascii="Times New Roman" w:hAnsi="Times New Roman" w:eastAsia="宋体" w:cs="Times New Roman"/>
+          <w:b w:val="0"/>
+          <w:sz w:val="24"/>
+        </w:rPr>
+        <w:t>同一套数据再试变压器自由决策，只需把 60 改成 0：python green_power_opt.py --x-gd 0 --mu-re 0，结果写到 out/x_gd_free_mu_zero/。</w:t>
+      </w:r>
+    </w:p>
+    <w:p>
+      <w:pPr>
+        <w:pStyle w:val="Heading2"/>
+        <w:spacing w:before="160" w:after="120"/>
+        <w:ind w:firstLine="0"/>
+      </w:pPr>
+      <w:r>
+        <w:rPr>
+          <w:rFonts w:ascii="Arial" w:hAnsi="Arial" w:eastAsia="黑体" w:cs="Arial"/>
+          <w:b/>
+          <w:color w:val="1F4E79"/>
+          <w:sz w:val="28"/>
+        </w:rPr>
+        <w:t>2.4 修改默认参数</w:t>
       </w:r>
     </w:p>
     <w:p>

</xml_diff>

<commit_message>
Switch the MILP solver from Gurobi to open-source SCIP.
Keep the same capacity-planning model and docs, using PySCIPOpt so the mobile branch no longer needs a commercial license.

Co-authored-by: Cursor <cursoragent@cursor.com>
</commit_message>
<xml_diff>
--- a/绿电直连微电网容量规划-使用说明.docx
+++ b/绿电直连微电网容量规划-使用说明.docx
@@ -77,7 +77,7 @@
           <w:b w:val="0"/>
           <w:sz w:val="24"/>
         </w:rPr>
-        <w:t>本仓库实现智算中心绿电直连场景下的风电、光伏、储能与并网变压器容量协同优化。模型以全年 8760 小时运行模拟为基础，用 Gurobi 求解混合整数线性规划（MILP），目标为最小化年化综合成本。默认场景锚定宁夏 110 kV 两部制工商业电价口径。</w:t>
+        <w:t>本仓库实现智算中心绿电直连场景下的风电、光伏、储能与并网变压器容量协同优化。模型以全年 8760 小时运行模拟为基础，用开源求解器 SCIP（PySCIPOpt）求解混合整数线性规划（MILP），目标为最小化年化综合成本。默认场景锚定宁夏 110 kV 两部制工商业电价口径。</w:t>
       </w:r>
     </w:p>
     <w:p>
@@ -257,14 +257,15 @@
             <w:pPr>
               <w:spacing w:after="0" w:before="0"/>
             </w:pPr>
-            <w:r/>
-            <w:r>
-              <w:rPr>
-                <w:rFonts w:ascii="Times New Roman" w:hAnsi="Times New Roman" w:eastAsia="宋体" w:cs="Times New Roman"/>
-                <w:b w:val="0"/>
-                <w:sz w:val="20"/>
-              </w:rPr>
-              <w:t>Gurobi 建模、求解与结果写出</w:t>
+            <w:r>
+              <w:t>SCIP 建模、求解与结果写出</w:t>
+            </w:r>
+            <w:r>
+              <w:rPr>
+                <w:rFonts w:ascii="Times New Roman" w:hAnsi="Times New Roman" w:eastAsia="宋体" w:cs="Times New Roman"/>
+                <w:b w:val="0"/>
+                <w:sz w:val="20"/>
+              </w:rPr>
             </w:r>
           </w:p>
         </w:tc>
@@ -365,14 +366,15 @@
             <w:pPr>
               <w:spacing w:after="0" w:before="0"/>
             </w:pPr>
-            <w:r/>
-            <w:r>
-              <w:rPr>
-                <w:rFonts w:ascii="Times New Roman" w:hAnsi="Times New Roman" w:eastAsia="宋体" w:cs="Times New Roman"/>
-                <w:b w:val="0"/>
-                <w:sz w:val="20"/>
-              </w:rPr>
-              <w:t>Python 依赖（numpy；Gurobi 需单独安装）</w:t>
+            <w:r>
+              <w:t>Python 依赖（numpy、pyscipopt；SCIP 随 pip/conda 安装，无需商业 License）</w:t>
+            </w:r>
+            <w:r>
+              <w:rPr>
+                <w:rFonts w:ascii="Times New Roman" w:hAnsi="Times New Roman" w:eastAsia="宋体" w:cs="Times New Roman"/>
+                <w:b w:val="0"/>
+                <w:sz w:val="20"/>
+              </w:rPr>
             </w:r>
           </w:p>
         </w:tc>
@@ -480,7 +482,7 @@
           <w:b w:val="0"/>
           <w:sz w:val="24"/>
         </w:rPr>
-        <w:t>需要 Python 3.9+、已授权的 Gurobi（含 gurobipy）以及 numpy。Gurobi License 与机器绑定，出现 HostID mismatch 时请在本机非沙箱环境运行。</w:t>
+        <w:t>需要 Python 3.9+、numpy，以及开源求解器 SCIP（通过 pyscipopt 调用）。无需商业 License。较新的 pyscipopt 会自带 SCIP；也可用 conda install --channel conda-forge pyscipopt。</w:t>
       </w:r>
     </w:p>
     <w:p>
@@ -497,7 +499,7 @@
         </w:rPr>
         <w:t>pip install -r requirements.txt</w:t>
         <w:br/>
-        <w:t>python -c "import gurobipy; print(gurobipy.gurobi.version())"</w:t>
+        <w:t>python -c "import pyscipopt; print(pyscipopt.__version__)"</w:t>
       </w:r>
     </w:p>
     <w:p>
@@ -1128,6 +1130,172 @@
                 <w:sz w:val="20"/>
               </w:rPr>
               <w:t>自动命名</w:t>
+            </w:r>
+          </w:p>
+        </w:tc>
+      </w:tr>
+      <w:tr>
+        <w:tc>
+          <w:tcPr>
+            <w:tcW w:type="dxa" w:w="3060"/>
+            <w:shd w:fill="FFFFFF" w:val="clear"/>
+            <w:tcBorders>
+              <w:top w:val="single" w:sz="4" w:space="0" w:color="8FAADC"/>
+              <w:left w:val="single" w:sz="4" w:space="0" w:color="8FAADC"/>
+              <w:bottom w:val="single" w:sz="4" w:space="0" w:color="8FAADC"/>
+              <w:right w:val="single" w:sz="4" w:space="0" w:color="8FAADC"/>
+            </w:tcBorders>
+          </w:tcPr>
+          <w:p>
+            <w:pPr>
+              <w:spacing w:after="0" w:before="0"/>
+            </w:pPr>
+            <w:r>
+              <w:t>--mip-gap</w:t>
+            </w:r>
+            <w:r>
+              <w:rPr>
+                <w:rFonts w:ascii="Times New Roman" w:hAnsi="Times New Roman" w:eastAsia="宋体" w:cs="Times New Roman"/>
+                <w:b w:val="0"/>
+                <w:sz w:val="20"/>
+              </w:rPr>
+            </w:r>
+          </w:p>
+        </w:tc>
+        <w:tc>
+          <w:tcPr>
+            <w:tcW w:type="dxa" w:w="3060"/>
+            <w:shd w:fill="FFFFFF" w:val="clear"/>
+            <w:tcBorders>
+              <w:top w:val="single" w:sz="4" w:space="0" w:color="8FAADC"/>
+              <w:left w:val="single" w:sz="4" w:space="0" w:color="8FAADC"/>
+              <w:bottom w:val="single" w:sz="4" w:space="0" w:color="8FAADC"/>
+              <w:right w:val="single" w:sz="4" w:space="0" w:color="8FAADC"/>
+            </w:tcBorders>
+          </w:tcPr>
+          <w:p>
+            <w:pPr>
+              <w:spacing w:after="0" w:before="0"/>
+            </w:pPr>
+            <w:r>
+              <w:t>相对 MIP 间隙（SCIP limits/gap）</w:t>
+            </w:r>
+            <w:r>
+              <w:rPr>
+                <w:rFonts w:ascii="Times New Roman" w:hAnsi="Times New Roman" w:eastAsia="宋体" w:cs="Times New Roman"/>
+                <w:b w:val="0"/>
+                <w:sz w:val="20"/>
+              </w:rPr>
+            </w:r>
+          </w:p>
+        </w:tc>
+        <w:tc>
+          <w:tcPr>
+            <w:tcW w:type="dxa" w:w="3060"/>
+            <w:shd w:fill="FFFFFF" w:val="clear"/>
+            <w:tcBorders>
+              <w:top w:val="single" w:sz="4" w:space="0" w:color="8FAADC"/>
+              <w:left w:val="single" w:sz="4" w:space="0" w:color="8FAADC"/>
+              <w:bottom w:val="single" w:sz="4" w:space="0" w:color="8FAADC"/>
+              <w:right w:val="single" w:sz="4" w:space="0" w:color="8FAADC"/>
+            </w:tcBorders>
+          </w:tcPr>
+          <w:p>
+            <w:pPr>
+              <w:spacing w:after="0" w:before="0"/>
+            </w:pPr>
+            <w:r>
+              <w:t>0.01</w:t>
+            </w:r>
+            <w:r>
+              <w:rPr>
+                <w:rFonts w:ascii="Times New Roman" w:hAnsi="Times New Roman" w:eastAsia="宋体" w:cs="Times New Roman"/>
+                <w:b w:val="0"/>
+                <w:sz w:val="20"/>
+              </w:rPr>
+            </w:r>
+          </w:p>
+        </w:tc>
+      </w:tr>
+      <w:tr>
+        <w:tc>
+          <w:tcPr>
+            <w:tcW w:type="dxa" w:w="3060"/>
+            <w:shd w:fill="FFFFFF" w:val="clear"/>
+            <w:tcBorders>
+              <w:top w:val="single" w:sz="4" w:space="0" w:color="8FAADC"/>
+              <w:left w:val="single" w:sz="4" w:space="0" w:color="8FAADC"/>
+              <w:bottom w:val="single" w:sz="4" w:space="0" w:color="8FAADC"/>
+              <w:right w:val="single" w:sz="4" w:space="0" w:color="8FAADC"/>
+            </w:tcBorders>
+          </w:tcPr>
+          <w:p>
+            <w:pPr>
+              <w:spacing w:after="0" w:before="0"/>
+            </w:pPr>
+            <w:r>
+              <w:t>--time-limit</w:t>
+            </w:r>
+            <w:r>
+              <w:rPr>
+                <w:rFonts w:ascii="Times New Roman" w:hAnsi="Times New Roman" w:eastAsia="宋体" w:cs="Times New Roman"/>
+                <w:b w:val="0"/>
+                <w:sz w:val="20"/>
+              </w:rPr>
+            </w:r>
+          </w:p>
+        </w:tc>
+        <w:tc>
+          <w:tcPr>
+            <w:tcW w:type="dxa" w:w="3060"/>
+            <w:shd w:fill="FFFFFF" w:val="clear"/>
+            <w:tcBorders>
+              <w:top w:val="single" w:sz="4" w:space="0" w:color="8FAADC"/>
+              <w:left w:val="single" w:sz="4" w:space="0" w:color="8FAADC"/>
+              <w:bottom w:val="single" w:sz="4" w:space="0" w:color="8FAADC"/>
+              <w:right w:val="single" w:sz="4" w:space="0" w:color="8FAADC"/>
+            </w:tcBorders>
+          </w:tcPr>
+          <w:p>
+            <w:pPr>
+              <w:spacing w:after="0" w:before="0"/>
+            </w:pPr>
+            <w:r>
+              <w:t>墙钟求解时限（秒）</w:t>
+            </w:r>
+            <w:r>
+              <w:rPr>
+                <w:rFonts w:ascii="Times New Roman" w:hAnsi="Times New Roman" w:eastAsia="宋体" w:cs="Times New Roman"/>
+                <w:b w:val="0"/>
+                <w:sz w:val="20"/>
+              </w:rPr>
+            </w:r>
+          </w:p>
+        </w:tc>
+        <w:tc>
+          <w:tcPr>
+            <w:tcW w:type="dxa" w:w="3060"/>
+            <w:shd w:fill="FFFFFF" w:val="clear"/>
+            <w:tcBorders>
+              <w:top w:val="single" w:sz="4" w:space="0" w:color="8FAADC"/>
+              <w:left w:val="single" w:sz="4" w:space="0" w:color="8FAADC"/>
+              <w:bottom w:val="single" w:sz="4" w:space="0" w:color="8FAADC"/>
+              <w:right w:val="single" w:sz="4" w:space="0" w:color="8FAADC"/>
+            </w:tcBorders>
+          </w:tcPr>
+          <w:p>
+            <w:pPr>
+              <w:spacing w:after="0" w:before="0"/>
+            </w:pPr>
+            <w:r>
+              <w:t>600</w:t>
+            </w:r>
+            <w:r>
+              <w:rPr>
+                <w:rFonts w:ascii="Times New Roman" w:hAnsi="Times New Roman" w:eastAsia="宋体" w:cs="Times New Roman"/>
+                <w:b w:val="0"/>
+                <w:sz w:val="20"/>
+              </w:rPr>
             </w:r>
           </w:p>
         </w:tc>
@@ -1414,14 +1582,15 @@
             <w:pPr>
               <w:spacing w:after="0" w:before="0"/>
             </w:pPr>
-            <w:r/>
-            <w:r>
-              <w:rPr>
-                <w:rFonts w:ascii="Times New Roman" w:hAnsi="Times New Roman" w:eastAsia="宋体" w:cs="Times New Roman"/>
-                <w:b w:val="0"/>
-                <w:sz w:val="20"/>
-              </w:rPr>
-              <w:t>python -c "import gurobipy; print(gurobipy.gurobi.version())"</w:t>
+            <w:r>
+              <w:t>python -c "import pyscipopt; print(pyscipopt.__version__)"</w:t>
+            </w:r>
+            <w:r>
+              <w:rPr>
+                <w:rFonts w:ascii="Times New Roman" w:hAnsi="Times New Roman" w:eastAsia="宋体" w:cs="Times New Roman"/>
+                <w:b w:val="0"/>
+                <w:sz w:val="20"/>
+              </w:rPr>
             </w:r>
           </w:p>
         </w:tc>
@@ -1440,14 +1609,15 @@
             <w:pPr>
               <w:spacing w:after="0" w:before="0"/>
             </w:pPr>
-            <w:r/>
-            <w:r>
-              <w:rPr>
-                <w:rFonts w:ascii="Times New Roman" w:hAnsi="Times New Roman" w:eastAsia="宋体" w:cs="Times New Roman"/>
-                <w:b w:val="0"/>
-                <w:sz w:val="20"/>
-              </w:rPr>
-              <w:t>打印 Gurobi 版本号；若报 HostID mismatch，换本机非沙箱环境</w:t>
+            <w:r>
+              <w:t>打印 pyscipopt 版本号；若 import 失败，先执行 pip install -r requirements.txt</w:t>
+            </w:r>
+            <w:r>
+              <w:rPr>
+                <w:rFonts w:ascii="Times New Roman" w:hAnsi="Times New Roman" w:eastAsia="宋体" w:cs="Times New Roman"/>
+                <w:b w:val="0"/>
+                <w:sz w:val="20"/>
+              </w:rPr>
             </w:r>
           </w:p>
         </w:tc>
@@ -1574,14 +1744,15 @@
             <w:pPr>
               <w:spacing w:after="0" w:before="0"/>
             </w:pPr>
-            <w:r/>
-            <w:r>
-              <w:rPr>
-                <w:rFonts w:ascii="Times New Roman" w:hAnsi="Times New Roman" w:eastAsia="宋体" w:cs="Times New Roman"/>
-                <w:b w:val="0"/>
-                <w:sz w:val="20"/>
-              </w:rPr>
-              <w:t>等待求解（8760 h MILP，通常数分钟，默认 MIPGap=1%、时限 300 秒）</w:t>
+            <w:r>
+              <w:t>等待求解（8760 h MILP，通常数分钟，默认相对间隙 1%、时限 600 秒）</w:t>
+            </w:r>
+            <w:r>
+              <w:rPr>
+                <w:rFonts w:ascii="Times New Roman" w:hAnsi="Times New Roman" w:eastAsia="宋体" w:cs="Times New Roman"/>
+                <w:b w:val="0"/>
+                <w:sz w:val="20"/>
+              </w:rPr>
             </w:r>
           </w:p>
         </w:tc>
@@ -2467,7 +2638,7 @@
           <w:b w:val="0"/>
           <w:sz w:val="24"/>
         </w:rPr>
-        <w:t>timeseries_results.csv 用于抽查逐时功率。任取一行应满足：P_WT + P_PV − P_ST_Charge + P_ST_Discharge + P_Grid_Buy − P_Grid_Sell = Load。若 Status 不是 OPTIMAL 但仍写出结果，表示到时限已有可行方案，容量仍可参考，只是未证明全局最优。若目录里出现 model.ilp 而没有上述两个文件，说明当前参数下模型不可行，需放宽 φ/θ 或增大占地、变压器等。</w:t>
+        <w:t>timeseries_results.csv 用于抽查逐时功率。任取一行应满足：P_WT + P_PV − P_ST_Charge + P_ST_Discharge + P_Grid_Buy − P_Grid_Sell = Load。若 Status 不是 OPTIMAL 但仍写出结果，表示到时限已有可行方案，容量仍可参考，只是未证明全局最优。若目录里出现 model.lp 而没有上述两个文件，说明当前参数下模型不可行，需放宽 φ/θ 或增大占地、变压器等。</w:t>
       </w:r>
     </w:p>
     <w:p>
@@ -2585,7 +2756,7 @@
           <w:b w:val="0"/>
           <w:sz w:val="24"/>
         </w:rPr>
-        <w:t>主要约束包括：逐时功率平衡；风光出力不超过资源上限；光伏占地；储能能量动态、充放互斥与功率上限；购售电互斥且不超过变压器容量；政策 φ（自发自用下限）、ψ（上网上限）、θ（绿电发电量/负荷下限）。默认 MIPGap=1%，主求解 TimeLimit=300 秒。</w:t>
+        <w:t>主要约束包括：逐时功率平衡；风光出力不超过资源上限；光伏占地；储能能量动态、充放互斥与功率上限；购售电互斥且不超过变压器容量；政策 φ（自发自用下限）、ψ（上网上限）、θ（绿电发电量/负荷下限）。默认相对 MIP 间隙 1%，墙钟时限 600 秒（SCIP；可用 --mip-gap / --time-limit 调整）。开源 SCIP 通常比商业求解器慢，8760 h 规模更容易碰到时限。</w:t>
       </w:r>
     </w:p>
     <w:p>
@@ -3212,7 +3383,7 @@
           <w:b w:val="0"/>
           <w:sz w:val="24"/>
         </w:rPr>
-        <w:t>每次成功求解在输出目录生成两个文件；若模型不可行，会写出 model.ilp（IIS 冲突约束）便于排查。</w:t>
+        <w:t>每次成功求解在输出目录生成两个文件；若模型不可行，会写出 model.lp（完整 LP，便于排查）。</w:t>
       </w:r>
     </w:p>
     <w:tbl>
@@ -4978,6 +5149,336 @@
                 <w:sz w:val="20"/>
               </w:rPr>
               <w:t>亩</w:t>
+            </w:r>
+          </w:p>
+        </w:tc>
+      </w:tr>
+      <w:tr>
+        <w:tc>
+          <w:tcPr>
+            <w:tcW w:type="dxa" w:w="2295"/>
+            <w:shd w:fill="FFFFFF" w:val="clear"/>
+            <w:tcBorders>
+              <w:top w:val="single" w:sz="4" w:space="0" w:color="8FAADC"/>
+              <w:left w:val="single" w:sz="4" w:space="0" w:color="8FAADC"/>
+              <w:bottom w:val="single" w:sz="4" w:space="0" w:color="8FAADC"/>
+              <w:right w:val="single" w:sz="4" w:space="0" w:color="8FAADC"/>
+            </w:tcBorders>
+          </w:tcPr>
+          <w:p>
+            <w:pPr>
+              <w:spacing w:after="0" w:before="0"/>
+            </w:pPr>
+            <w:r>
+              <w:t>X_WT_MAX</w:t>
+            </w:r>
+            <w:r>
+              <w:rPr>
+                <w:rFonts w:ascii="Times New Roman" w:hAnsi="Times New Roman" w:eastAsia="宋体" w:cs="Times New Roman"/>
+                <w:b w:val="0"/>
+                <w:sz w:val="20"/>
+              </w:rPr>
+            </w:r>
+          </w:p>
+        </w:tc>
+        <w:tc>
+          <w:tcPr>
+            <w:tcW w:type="dxa" w:w="2295"/>
+            <w:shd w:fill="FFFFFF" w:val="clear"/>
+            <w:tcBorders>
+              <w:top w:val="single" w:sz="4" w:space="0" w:color="8FAADC"/>
+              <w:left w:val="single" w:sz="4" w:space="0" w:color="8FAADC"/>
+              <w:bottom w:val="single" w:sz="4" w:space="0" w:color="8FAADC"/>
+              <w:right w:val="single" w:sz="4" w:space="0" w:color="8FAADC"/>
+            </w:tcBorders>
+          </w:tcPr>
+          <w:p>
+            <w:pPr>
+              <w:spacing w:after="0" w:before="0"/>
+            </w:pPr>
+            <w:r>
+              <w:t>风电装机决策上界（便于开源求解器）</w:t>
+            </w:r>
+            <w:r>
+              <w:rPr>
+                <w:rFonts w:ascii="Times New Roman" w:hAnsi="Times New Roman" w:eastAsia="宋体" w:cs="Times New Roman"/>
+                <w:b w:val="0"/>
+                <w:sz w:val="20"/>
+              </w:rPr>
+            </w:r>
+          </w:p>
+        </w:tc>
+        <w:tc>
+          <w:tcPr>
+            <w:tcW w:type="dxa" w:w="2295"/>
+            <w:shd w:fill="FFFFFF" w:val="clear"/>
+            <w:tcBorders>
+              <w:top w:val="single" w:sz="4" w:space="0" w:color="8FAADC"/>
+              <w:left w:val="single" w:sz="4" w:space="0" w:color="8FAADC"/>
+              <w:bottom w:val="single" w:sz="4" w:space="0" w:color="8FAADC"/>
+              <w:right w:val="single" w:sz="4" w:space="0" w:color="8FAADC"/>
+            </w:tcBorders>
+          </w:tcPr>
+          <w:p>
+            <w:pPr>
+              <w:spacing w:after="0" w:before="0"/>
+            </w:pPr>
+            <w:r>
+              <w:t>500</w:t>
+            </w:r>
+            <w:r>
+              <w:rPr>
+                <w:rFonts w:ascii="Times New Roman" w:hAnsi="Times New Roman" w:eastAsia="宋体" w:cs="Times New Roman"/>
+                <w:b w:val="0"/>
+                <w:sz w:val="20"/>
+              </w:rPr>
+            </w:r>
+          </w:p>
+        </w:tc>
+        <w:tc>
+          <w:tcPr>
+            <w:tcW w:type="dxa" w:w="2295"/>
+            <w:shd w:fill="FFFFFF" w:val="clear"/>
+            <w:tcBorders>
+              <w:top w:val="single" w:sz="4" w:space="0" w:color="8FAADC"/>
+              <w:left w:val="single" w:sz="4" w:space="0" w:color="8FAADC"/>
+              <w:bottom w:val="single" w:sz="4" w:space="0" w:color="8FAADC"/>
+              <w:right w:val="single" w:sz="4" w:space="0" w:color="8FAADC"/>
+            </w:tcBorders>
+          </w:tcPr>
+          <w:p>
+            <w:pPr>
+              <w:spacing w:after="0" w:before="0"/>
+            </w:pPr>
+            <w:r>
+              <w:t>MW</w:t>
+            </w:r>
+            <w:r>
+              <w:rPr>
+                <w:rFonts w:ascii="Times New Roman" w:hAnsi="Times New Roman" w:eastAsia="宋体" w:cs="Times New Roman"/>
+                <w:b w:val="0"/>
+                <w:sz w:val="20"/>
+              </w:rPr>
+            </w:r>
+          </w:p>
+        </w:tc>
+      </w:tr>
+      <w:tr>
+        <w:tc>
+          <w:tcPr>
+            <w:tcW w:type="dxa" w:w="2295"/>
+            <w:shd w:fill="FFFFFF" w:val="clear"/>
+            <w:tcBorders>
+              <w:top w:val="single" w:sz="4" w:space="0" w:color="8FAADC"/>
+              <w:left w:val="single" w:sz="4" w:space="0" w:color="8FAADC"/>
+              <w:bottom w:val="single" w:sz="4" w:space="0" w:color="8FAADC"/>
+              <w:right w:val="single" w:sz="4" w:space="0" w:color="8FAADC"/>
+            </w:tcBorders>
+          </w:tcPr>
+          <w:p>
+            <w:pPr>
+              <w:spacing w:after="0" w:before="0"/>
+            </w:pPr>
+            <w:r>
+              <w:t>X_ST_MAX</w:t>
+            </w:r>
+            <w:r>
+              <w:rPr>
+                <w:rFonts w:ascii="Times New Roman" w:hAnsi="Times New Roman" w:eastAsia="宋体" w:cs="Times New Roman"/>
+                <w:b w:val="0"/>
+                <w:sz w:val="20"/>
+              </w:rPr>
+            </w:r>
+          </w:p>
+        </w:tc>
+        <w:tc>
+          <w:tcPr>
+            <w:tcW w:type="dxa" w:w="2295"/>
+            <w:shd w:fill="FFFFFF" w:val="clear"/>
+            <w:tcBorders>
+              <w:top w:val="single" w:sz="4" w:space="0" w:color="8FAADC"/>
+              <w:left w:val="single" w:sz="4" w:space="0" w:color="8FAADC"/>
+              <w:bottom w:val="single" w:sz="4" w:space="0" w:color="8FAADC"/>
+              <w:right w:val="single" w:sz="4" w:space="0" w:color="8FAADC"/>
+            </w:tcBorders>
+          </w:tcPr>
+          <w:p>
+            <w:pPr>
+              <w:spacing w:after="0" w:before="0"/>
+            </w:pPr>
+            <w:r>
+              <w:t>储能能量决策上界</w:t>
+            </w:r>
+            <w:r>
+              <w:rPr>
+                <w:rFonts w:ascii="Times New Roman" w:hAnsi="Times New Roman" w:eastAsia="宋体" w:cs="Times New Roman"/>
+                <w:b w:val="0"/>
+                <w:sz w:val="20"/>
+              </w:rPr>
+            </w:r>
+          </w:p>
+        </w:tc>
+        <w:tc>
+          <w:tcPr>
+            <w:tcW w:type="dxa" w:w="2295"/>
+            <w:shd w:fill="FFFFFF" w:val="clear"/>
+            <w:tcBorders>
+              <w:top w:val="single" w:sz="4" w:space="0" w:color="8FAADC"/>
+              <w:left w:val="single" w:sz="4" w:space="0" w:color="8FAADC"/>
+              <w:bottom w:val="single" w:sz="4" w:space="0" w:color="8FAADC"/>
+              <w:right w:val="single" w:sz="4" w:space="0" w:color="8FAADC"/>
+            </w:tcBorders>
+          </w:tcPr>
+          <w:p>
+            <w:pPr>
+              <w:spacing w:after="0" w:before="0"/>
+            </w:pPr>
+            <w:r>
+              <w:t>2000</w:t>
+            </w:r>
+            <w:r>
+              <w:rPr>
+                <w:rFonts w:ascii="Times New Roman" w:hAnsi="Times New Roman" w:eastAsia="宋体" w:cs="Times New Roman"/>
+                <w:b w:val="0"/>
+                <w:sz w:val="20"/>
+              </w:rPr>
+            </w:r>
+          </w:p>
+        </w:tc>
+        <w:tc>
+          <w:tcPr>
+            <w:tcW w:type="dxa" w:w="2295"/>
+            <w:shd w:fill="FFFFFF" w:val="clear"/>
+            <w:tcBorders>
+              <w:top w:val="single" w:sz="4" w:space="0" w:color="8FAADC"/>
+              <w:left w:val="single" w:sz="4" w:space="0" w:color="8FAADC"/>
+              <w:bottom w:val="single" w:sz="4" w:space="0" w:color="8FAADC"/>
+              <w:right w:val="single" w:sz="4" w:space="0" w:color="8FAADC"/>
+            </w:tcBorders>
+          </w:tcPr>
+          <w:p>
+            <w:pPr>
+              <w:spacing w:after="0" w:before="0"/>
+            </w:pPr>
+            <w:r>
+              <w:t>MWh</w:t>
+            </w:r>
+            <w:r>
+              <w:rPr>
+                <w:rFonts w:ascii="Times New Roman" w:hAnsi="Times New Roman" w:eastAsia="宋体" w:cs="Times New Roman"/>
+                <w:b w:val="0"/>
+                <w:sz w:val="20"/>
+              </w:rPr>
+            </w:r>
+          </w:p>
+        </w:tc>
+      </w:tr>
+      <w:tr>
+        <w:tc>
+          <w:tcPr>
+            <w:tcW w:type="dxa" w:w="2295"/>
+            <w:shd w:fill="FFFFFF" w:val="clear"/>
+            <w:tcBorders>
+              <w:top w:val="single" w:sz="4" w:space="0" w:color="8FAADC"/>
+              <w:left w:val="single" w:sz="4" w:space="0" w:color="8FAADC"/>
+              <w:bottom w:val="single" w:sz="4" w:space="0" w:color="8FAADC"/>
+              <w:right w:val="single" w:sz="4" w:space="0" w:color="8FAADC"/>
+            </w:tcBorders>
+          </w:tcPr>
+          <w:p>
+            <w:pPr>
+              <w:spacing w:after="0" w:before="0"/>
+            </w:pPr>
+            <w:r>
+              <w:t>X_GD_MAX</w:t>
+            </w:r>
+            <w:r>
+              <w:rPr>
+                <w:rFonts w:ascii="Times New Roman" w:hAnsi="Times New Roman" w:eastAsia="宋体" w:cs="Times New Roman"/>
+                <w:b w:val="0"/>
+                <w:sz w:val="20"/>
+              </w:rPr>
+            </w:r>
+          </w:p>
+        </w:tc>
+        <w:tc>
+          <w:tcPr>
+            <w:tcW w:type="dxa" w:w="2295"/>
+            <w:shd w:fill="FFFFFF" w:val="clear"/>
+            <w:tcBorders>
+              <w:top w:val="single" w:sz="4" w:space="0" w:color="8FAADC"/>
+              <w:left w:val="single" w:sz="4" w:space="0" w:color="8FAADC"/>
+              <w:bottom w:val="single" w:sz="4" w:space="0" w:color="8FAADC"/>
+              <w:right w:val="single" w:sz="4" w:space="0" w:color="8FAADC"/>
+            </w:tcBorders>
+          </w:tcPr>
+          <w:p>
+            <w:pPr>
+              <w:spacing w:after="0" w:before="0"/>
+            </w:pPr>
+            <w:r>
+              <w:t>变压器决策上界（--x-gd 0 时）</w:t>
+            </w:r>
+            <w:r>
+              <w:rPr>
+                <w:rFonts w:ascii="Times New Roman" w:hAnsi="Times New Roman" w:eastAsia="宋体" w:cs="Times New Roman"/>
+                <w:b w:val="0"/>
+                <w:sz w:val="20"/>
+              </w:rPr>
+            </w:r>
+          </w:p>
+        </w:tc>
+        <w:tc>
+          <w:tcPr>
+            <w:tcW w:type="dxa" w:w="2295"/>
+            <w:shd w:fill="FFFFFF" w:val="clear"/>
+            <w:tcBorders>
+              <w:top w:val="single" w:sz="4" w:space="0" w:color="8FAADC"/>
+              <w:left w:val="single" w:sz="4" w:space="0" w:color="8FAADC"/>
+              <w:bottom w:val="single" w:sz="4" w:space="0" w:color="8FAADC"/>
+              <w:right w:val="single" w:sz="4" w:space="0" w:color="8FAADC"/>
+            </w:tcBorders>
+          </w:tcPr>
+          <w:p>
+            <w:pPr>
+              <w:spacing w:after="0" w:before="0"/>
+            </w:pPr>
+            <w:r>
+              <w:t>200</w:t>
+            </w:r>
+            <w:r>
+              <w:rPr>
+                <w:rFonts w:ascii="Times New Roman" w:hAnsi="Times New Roman" w:eastAsia="宋体" w:cs="Times New Roman"/>
+                <w:b w:val="0"/>
+                <w:sz w:val="20"/>
+              </w:rPr>
+            </w:r>
+          </w:p>
+        </w:tc>
+        <w:tc>
+          <w:tcPr>
+            <w:tcW w:type="dxa" w:w="2295"/>
+            <w:shd w:fill="FFFFFF" w:val="clear"/>
+            <w:tcBorders>
+              <w:top w:val="single" w:sz="4" w:space="0" w:color="8FAADC"/>
+              <w:left w:val="single" w:sz="4" w:space="0" w:color="8FAADC"/>
+              <w:bottom w:val="single" w:sz="4" w:space="0" w:color="8FAADC"/>
+              <w:right w:val="single" w:sz="4" w:space="0" w:color="8FAADC"/>
+            </w:tcBorders>
+          </w:tcPr>
+          <w:p>
+            <w:pPr>
+              <w:spacing w:after="0" w:before="0"/>
+            </w:pPr>
+            <w:r>
+              <w:t>MW</w:t>
+            </w:r>
+            <w:r>
+              <w:rPr>
+                <w:rFonts w:ascii="Times New Roman" w:hAnsi="Times New Roman" w:eastAsia="宋体" w:cs="Times New Roman"/>
+                <w:b w:val="0"/>
+                <w:sz w:val="20"/>
+              </w:rPr>
             </w:r>
           </w:p>
         </w:tc>
@@ -9993,6 +10494,10 @@
         <w:br/>
         <w:t xml:space="preserve"> Optimization Terminated! Status: OPTIMAL</w:t>
         <w:br/>
+        <w:t xml:space="preserve"> Solver: SCIP (PySCIPOpt)</w:t>
+        <w:br/>
+        <w:t xml:space="preserve"> MIP gap: 0.00%</w:t>
+        <w:br/>
         <w:t xml:space="preserve"> Total Annualized Objective: 17891.57 万元/年</w:t>
         <w:br/>
         <w:t>============================================================</w:t>
@@ -10170,14 +10675,15 @@
             <w:pPr>
               <w:spacing w:after="0" w:before="0"/>
             </w:pPr>
-            <w:r/>
-            <w:r>
-              <w:rPr>
-                <w:rFonts w:ascii="Times New Roman" w:hAnsi="Times New Roman" w:eastAsia="宋体" w:cs="Times New Roman"/>
-                <w:b w:val="0"/>
-                <w:sz w:val="20"/>
-              </w:rPr>
-              <w:t>OPTIMAL 表示在 MIPGap 内认定最优；UNFINISHED 表示到时限仍有可行解但未证明最优；不可行时不会生成该文件，而会写 model.ilp。</w:t>
+            <w:r>
+              <w:t>OPTIMAL 表示在相对 MIP 间隙内认定最优；UNFINISHED 表示到时限仍有可行解但未证明最优。结果文件另有 MIP gap 一行。不可行时不会生成该文件，而会写 model.lp（SCIP 不提供 IIS 冲突约束分析）。</w:t>
+            </w:r>
+            <w:r>
+              <w:rPr>
+                <w:rFonts w:ascii="Times New Roman" w:hAnsi="Times New Roman" w:eastAsia="宋体" w:cs="Times New Roman"/>
+                <w:b w:val="0"/>
+                <w:sz w:val="20"/>
+              </w:rPr>
             </w:r>
           </w:p>
         </w:tc>
@@ -10232,6 +10738,118 @@
                 <w:sz w:val="20"/>
               </w:rPr>
               <w:t>目标函数 J，单位万元/年。含 R×投资、各类电费与基金，减去上网收益。</w:t>
+            </w:r>
+          </w:p>
+        </w:tc>
+      </w:tr>
+      <w:tr>
+        <w:tc>
+          <w:tcPr>
+            <w:tcW w:type="dxa" w:w="4589"/>
+            <w:shd w:fill="FFFFFF" w:val="clear"/>
+            <w:tcBorders>
+              <w:top w:val="single" w:sz="4" w:space="0" w:color="8FAADC"/>
+              <w:left w:val="single" w:sz="4" w:space="0" w:color="8FAADC"/>
+              <w:bottom w:val="single" w:sz="4" w:space="0" w:color="8FAADC"/>
+              <w:right w:val="single" w:sz="4" w:space="0" w:color="8FAADC"/>
+            </w:tcBorders>
+          </w:tcPr>
+          <w:p>
+            <w:pPr>
+              <w:spacing w:after="0" w:before="0"/>
+            </w:pPr>
+            <w:r>
+              <w:t>Solver</w:t>
+            </w:r>
+            <w:r>
+              <w:rPr>
+                <w:rFonts w:ascii="Times New Roman" w:hAnsi="Times New Roman" w:eastAsia="宋体" w:cs="Times New Roman"/>
+                <w:b w:val="0"/>
+                <w:sz w:val="20"/>
+              </w:rPr>
+            </w:r>
+          </w:p>
+        </w:tc>
+        <w:tc>
+          <w:tcPr>
+            <w:tcW w:type="dxa" w:w="4589"/>
+            <w:shd w:fill="FFFFFF" w:val="clear"/>
+            <w:tcBorders>
+              <w:top w:val="single" w:sz="4" w:space="0" w:color="8FAADC"/>
+              <w:left w:val="single" w:sz="4" w:space="0" w:color="8FAADC"/>
+              <w:bottom w:val="single" w:sz="4" w:space="0" w:color="8FAADC"/>
+              <w:right w:val="single" w:sz="4" w:space="0" w:color="8FAADC"/>
+            </w:tcBorders>
+          </w:tcPr>
+          <w:p>
+            <w:pPr>
+              <w:spacing w:after="0" w:before="0"/>
+            </w:pPr>
+            <w:r>
+              <w:t>求解器标识，例如 SCIP (PySCIPOpt 6.2.1)。</w:t>
+            </w:r>
+            <w:r>
+              <w:rPr>
+                <w:rFonts w:ascii="Times New Roman" w:hAnsi="Times New Roman" w:eastAsia="宋体" w:cs="Times New Roman"/>
+                <w:b w:val="0"/>
+                <w:sz w:val="20"/>
+              </w:rPr>
+            </w:r>
+          </w:p>
+        </w:tc>
+      </w:tr>
+      <w:tr>
+        <w:tc>
+          <w:tcPr>
+            <w:tcW w:type="dxa" w:w="4589"/>
+            <w:shd w:fill="FFFFFF" w:val="clear"/>
+            <w:tcBorders>
+              <w:top w:val="single" w:sz="4" w:space="0" w:color="8FAADC"/>
+              <w:left w:val="single" w:sz="4" w:space="0" w:color="8FAADC"/>
+              <w:bottom w:val="single" w:sz="4" w:space="0" w:color="8FAADC"/>
+              <w:right w:val="single" w:sz="4" w:space="0" w:color="8FAADC"/>
+            </w:tcBorders>
+          </w:tcPr>
+          <w:p>
+            <w:pPr>
+              <w:spacing w:after="0" w:before="0"/>
+            </w:pPr>
+            <w:r>
+              <w:t>MIP gap</w:t>
+            </w:r>
+            <w:r>
+              <w:rPr>
+                <w:rFonts w:ascii="Times New Roman" w:hAnsi="Times New Roman" w:eastAsia="宋体" w:cs="Times New Roman"/>
+                <w:b w:val="0"/>
+                <w:sz w:val="20"/>
+              </w:rPr>
+            </w:r>
+          </w:p>
+        </w:tc>
+        <w:tc>
+          <w:tcPr>
+            <w:tcW w:type="dxa" w:w="4589"/>
+            <w:shd w:fill="FFFFFF" w:val="clear"/>
+            <w:tcBorders>
+              <w:top w:val="single" w:sz="4" w:space="0" w:color="8FAADC"/>
+              <w:left w:val="single" w:sz="4" w:space="0" w:color="8FAADC"/>
+              <w:bottom w:val="single" w:sz="4" w:space="0" w:color="8FAADC"/>
+              <w:right w:val="single" w:sz="4" w:space="0" w:color="8FAADC"/>
+            </w:tcBorders>
+          </w:tcPr>
+          <w:p>
+            <w:pPr>
+              <w:spacing w:after="0" w:before="0"/>
+            </w:pPr>
+            <w:r>
+              <w:t>相对 MIP 间隙。OPTIMAL 时接近 0%；UNFINISHED 时请看此值判断可行解质量。</w:t>
+            </w:r>
+            <w:r>
+              <w:rPr>
+                <w:rFonts w:ascii="Times New Roman" w:hAnsi="Times New Roman" w:eastAsia="宋体" w:cs="Times New Roman"/>
+                <w:b w:val="0"/>
+                <w:sz w:val="20"/>
+              </w:rPr>
             </w:r>
           </w:p>
         </w:tc>
@@ -12348,7 +12966,7 @@
           <w:b w:val="0"/>
           <w:sz w:val="24"/>
         </w:rPr>
-        <w:t>（1）求解为大规模 8760 h MILP，可能需数分钟。可在 green_power_opt.py 中调整 MAIN_MIP_GAP 与 TimeLimit。</w:t>
+        <w:t>（1）求解为大规模 8760 h MILP，可能需数分钟。可用命令行 --mip-gap / --time-limit 调整，或改 green_power_opt.py 中的默认值。开源 SCIP 通常比商业求解器慢。</w:t>
       </w:r>
     </w:p>
     <w:p>
@@ -12396,6 +13014,8 @@
       </w:r>
     </w:p>
     <w:sectPr>
+      <w:headerReference w:type="default" r:id="rId9"/>
+      <w:footerReference w:type="default" r:id="rId10"/>
       <w:pgSz w:w="12240" w:h="15840"/>
       <w:pgMar w:top="1440" w:right="1474" w:bottom="1440" w:left="1587" w:header="720" w:footer="720" w:gutter="0"/>
       <w:cols w:space="720"/>
@@ -12403,6 +13023,26 @@
     </w:sectPr>
   </w:body>
 </w:document>
+</file>
+
+<file path=word/footer1.xml><?xml version="1.0" encoding="utf-8"?>
+<w:ftr xmlns:m="http://schemas.openxmlformats.org/officeDocument/2006/math" xmlns:mc="http://schemas.openxmlformats.org/markup-compatibility/2006" xmlns:mo="http://schemas.microsoft.com/office/mac/office/2008/main" xmlns:mv="urn:schemas-microsoft-com:mac:vml" xmlns:o="urn:schemas-microsoft-com:office:office" xmlns:r="http://schemas.openxmlformats.org/officeDocument/2006/relationships" xmlns:v="urn:schemas-microsoft-com:vml" xmlns:w10="urn:schemas-microsoft-com:office:word" xmlns:w14="http://schemas.microsoft.com/office/word/2010/wordml" xmlns:w="http://schemas.openxmlformats.org/wordprocessingml/2006/main" xmlns:wne="http://schemas.microsoft.com/office/word/2006/wordml" xmlns:wp14="http://schemas.microsoft.com/office/word/2010/wordprocessingDrawing" xmlns:wp="http://schemas.openxmlformats.org/drawingml/2006/wordprocessingDrawing" xmlns:wpc="http://schemas.microsoft.com/office/word/2010/wordprocessingCanvas" xmlns:wpg="http://schemas.microsoft.com/office/word/2010/wordprocessingGroup" xmlns:wpi="http://schemas.microsoft.com/office/word/2010/wordprocessingInk" xmlns:wps="http://schemas.microsoft.com/office/word/2010/wordprocessingShape" mc:Ignorable="w14 wp14">
+  <w:p>
+    <w:pPr>
+      <w:pStyle w:val="Footer"/>
+    </w:pPr>
+  </w:p>
+</w:ftr>
+</file>
+
+<file path=word/header1.xml><?xml version="1.0" encoding="utf-8"?>
+<w:hdr xmlns:m="http://schemas.openxmlformats.org/officeDocument/2006/math" xmlns:mc="http://schemas.openxmlformats.org/markup-compatibility/2006" xmlns:mo="http://schemas.microsoft.com/office/mac/office/2008/main" xmlns:mv="urn:schemas-microsoft-com:mac:vml" xmlns:o="urn:schemas-microsoft-com:office:office" xmlns:r="http://schemas.openxmlformats.org/officeDocument/2006/relationships" xmlns:v="urn:schemas-microsoft-com:vml" xmlns:w10="urn:schemas-microsoft-com:office:word" xmlns:w14="http://schemas.microsoft.com/office/word/2010/wordml" xmlns:w="http://schemas.openxmlformats.org/wordprocessingml/2006/main" xmlns:wne="http://schemas.microsoft.com/office/word/2006/wordml" xmlns:wp14="http://schemas.microsoft.com/office/word/2010/wordprocessingDrawing" xmlns:wp="http://schemas.openxmlformats.org/drawingml/2006/wordprocessingDrawing" xmlns:wpc="http://schemas.microsoft.com/office/word/2010/wordprocessingCanvas" xmlns:wpg="http://schemas.microsoft.com/office/word/2010/wordprocessingGroup" xmlns:wpi="http://schemas.microsoft.com/office/word/2010/wordprocessingInk" xmlns:wps="http://schemas.microsoft.com/office/word/2010/wordprocessingShape" mc:Ignorable="w14 wp14">
+  <w:p>
+    <w:pPr>
+      <w:pStyle w:val="Header"/>
+    </w:pPr>
+  </w:p>
+</w:hdr>
 </file>
 
 <file path=word/numbering.xml><?xml version="1.0" encoding="utf-8"?>

</xml_diff>